<commit_message>
ISO W10 sapuan SOP HR: HR-SOP-08 (HR-SOP-10, 11, 12 putaran perbaikan)
Co-Authored-By: Claude Opus 5.5 <noreply@anthropic.com>
Claude-Session: https://claude.ai/code/session_01BhkCQM7h3krZb9kjY2Nate
</commit_message>
<xml_diff>
--- a/out/02_HR/SNX-HR-SOP-08 Company Leaves (Rev00 DRAFT).docx
+++ b/out/02_HR/SNX-HR-SOP-08 Company Leaves (Rev00 DRAFT).docx
@@ -217,6 +217,7 @@
     <w:p>
       <w:pPr>
         <w:pStyle w:val="Heading1"/>
+        <w:keepNext/>
         <w:widowControl w:val="0"/>
         <w:spacing w:line="240" w:lineRule="auto"/>
         <w:ind w:right="407" w:firstLine="0"/>
@@ -511,6 +512,10 @@
         <w:gridCol w:w="5850"/>
       </w:tblGrid>
       <w:tr>
+        <w:trPr>
+          <w:cantSplit/>
+          <w:tblHeader/>
+        </w:trPr>
         <w:tc>
           <w:tcPr>
             <w:tcW w:w="3150" w:type="dxa"/>
@@ -523,6 +528,7 @@
           </w:tcPr>
           <w:p>
             <w:pPr>
+              <w:keepNext/>
               <w:widowControl w:val="0"/>
               <w:pBdr>
                 <w:top w:val="nil"/>
@@ -563,6 +569,7 @@
           </w:tcPr>
           <w:p>
             <w:pPr>
+              <w:keepNext/>
               <w:widowControl w:val="0"/>
               <w:pBdr>
                 <w:top w:val="nil"/>
@@ -593,6 +600,9 @@
         </w:tc>
       </w:tr>
       <w:tr>
+        <w:trPr>
+          <w:cantSplit/>
+        </w:trPr>
         <w:tc>
           <w:tcPr>
             <w:tcW w:w="3150" w:type="dxa"/>
@@ -646,6 +656,9 @@
         </w:tc>
       </w:tr>
       <w:tr>
+        <w:trPr>
+          <w:cantSplit/>
+        </w:trPr>
         <w:tc>
           <w:tcPr>
             <w:tcW w:w="3150" w:type="dxa"/>
@@ -699,6 +712,9 @@
         </w:tc>
       </w:tr>
       <w:tr>
+        <w:trPr>
+          <w:cantSplit/>
+        </w:trPr>
         <w:tc>
           <w:tcPr>
             <w:tcW w:w="3150" w:type="dxa"/>
@@ -750,6 +766,9 @@
         </w:tc>
       </w:tr>
       <w:tr>
+        <w:trPr>
+          <w:cantSplit/>
+        </w:trPr>
         <w:tc>
           <w:tcPr>
             <w:tcW w:w="3150" w:type="dxa"/>
@@ -810,6 +829,9 @@
         </w:tc>
       </w:tr>
       <w:tr>
+        <w:trPr>
+          <w:cantSplit/>
+        </w:trPr>
         <w:tc>
           <w:tcPr>
             <w:tcW w:w="3150" w:type="dxa"/>
@@ -861,6 +883,9 @@
         </w:tc>
       </w:tr>
       <w:tr>
+        <w:trPr>
+          <w:cantSplit/>
+        </w:trPr>
         <w:tc>
           <w:tcPr>
             <w:tcW w:w="3150" w:type="dxa"/>
@@ -914,6 +939,9 @@
         </w:tc>
       </w:tr>
       <w:tr>
+        <w:trPr>
+          <w:cantSplit/>
+        </w:trPr>
         <w:tc>
           <w:tcPr>
             <w:tcW w:w="3150" w:type="dxa"/>
@@ -967,6 +995,9 @@
         </w:tc>
       </w:tr>
       <w:tr>
+        <w:trPr>
+          <w:cantSplit/>
+        </w:trPr>
         <w:tc>
           <w:tcPr>
             <w:tcW w:w="3150" w:type="dxa"/>
@@ -1020,6 +1051,9 @@
         </w:tc>
       </w:tr>
       <w:tr>
+        <w:trPr>
+          <w:cantSplit/>
+        </w:trPr>
         <w:tc>
           <w:tcPr>
             <w:tcW w:w="3150" w:type="dxa"/>
@@ -1073,6 +1107,9 @@
         </w:tc>
       </w:tr>
       <w:tr>
+        <w:trPr>
+          <w:cantSplit/>
+        </w:trPr>
         <w:tc>
           <w:tcPr>
             <w:tcW w:w="3150" w:type="dxa"/>
@@ -1126,6 +1163,9 @@
         </w:tc>
       </w:tr>
       <w:tr>
+        <w:trPr>
+          <w:cantSplit/>
+        </w:trPr>
         <w:tc>
           <w:tcPr>
             <w:tcW w:w="3150" w:type="dxa"/>
@@ -1207,6 +1247,7 @@
     <w:p>
       <w:pPr>
         <w:pStyle w:val="Heading1"/>
+        <w:keepNext/>
         <w:widowControl w:val="0"/>
         <w:spacing w:before="816" w:line="240" w:lineRule="auto"/>
         <w:ind w:right="407"/>
@@ -1243,6 +1284,10 @@
         <w:gridCol w:w="3010"/>
       </w:tblGrid>
       <w:tr>
+        <w:trPr>
+          <w:cantSplit/>
+          <w:tblHeader/>
+        </w:trPr>
         <w:tc>
           <w:tcPr>
             <w:tcW w:w="3009" w:type="dxa"/>
@@ -1255,6 +1300,7 @@
           </w:tcPr>
           <w:p>
             <w:pPr>
+              <w:keepNext/>
               <w:widowControl w:val="0"/>
               <w:spacing w:line="240" w:lineRule="auto"/>
               <w:jc w:val="center"/>
@@ -1288,6 +1334,7 @@
           </w:tcPr>
           <w:p>
             <w:pPr>
+              <w:keepNext/>
               <w:widowControl w:val="0"/>
               <w:spacing w:line="240" w:lineRule="auto"/>
               <w:jc w:val="center"/>
@@ -1321,6 +1368,7 @@
           </w:tcPr>
           <w:p>
             <w:pPr>
+              <w:keepNext/>
               <w:widowControl w:val="0"/>
               <w:spacing w:line="240" w:lineRule="auto"/>
               <w:jc w:val="center"/>
@@ -1344,6 +1392,9 @@
         </w:tc>
       </w:tr>
       <w:tr>
+        <w:trPr>
+          <w:cantSplit/>
+        </w:trPr>
         <w:tc>
           <w:tcPr>
             <w:tcW w:w="3009" w:type="dxa"/>
@@ -1392,6 +1443,9 @@
         </w:tc>
       </w:tr>
       <w:tr>
+        <w:trPr>
+          <w:cantSplit/>
+        </w:trPr>
         <w:tc>
           <w:tcPr>
             <w:tcW w:w="3009" w:type="dxa"/>
@@ -1463,6 +1517,9 @@
         </w:tc>
       </w:tr>
       <w:tr>
+        <w:trPr>
+          <w:cantSplit/>
+        </w:trPr>
         <w:tc>
           <w:tcPr>
             <w:tcW w:w="3009" w:type="dxa"/>
@@ -1537,6 +1594,7 @@
     <w:p>
       <w:pPr>
         <w:pStyle w:val="Heading1"/>
+        <w:keepNext/>
         <w:widowControl w:val="0"/>
         <w:spacing w:before="816" w:line="240" w:lineRule="auto"/>
         <w:ind w:right="407"/>
@@ -1578,6 +1636,10 @@
         <w:gridCol w:w="2235"/>
       </w:tblGrid>
       <w:tr>
+        <w:trPr>
+          <w:cantSplit/>
+          <w:tblHeader/>
+        </w:trPr>
         <w:tc>
           <w:tcPr>
             <w:tcW w:w="810" w:type="dxa"/>
@@ -1590,6 +1652,7 @@
           </w:tcPr>
           <w:p>
             <w:pPr>
+              <w:keepNext/>
               <w:widowControl w:val="0"/>
               <w:pBdr>
                 <w:top w:val="nil"/>
@@ -1630,6 +1693,7 @@
           </w:tcPr>
           <w:p>
             <w:pPr>
+              <w:keepNext/>
               <w:widowControl w:val="0"/>
               <w:spacing w:line="240" w:lineRule="auto"/>
               <w:jc w:val="center"/>
@@ -1663,6 +1727,7 @@
           </w:tcPr>
           <w:p>
             <w:pPr>
+              <w:keepNext/>
               <w:widowControl w:val="0"/>
               <w:pBdr>
                 <w:top w:val="nil"/>
@@ -1703,6 +1768,7 @@
           </w:tcPr>
           <w:p>
             <w:pPr>
+              <w:keepNext/>
               <w:widowControl w:val="0"/>
               <w:pBdr>
                 <w:top w:val="nil"/>
@@ -1733,6 +1799,9 @@
         </w:tc>
       </w:tr>
       <w:tr>
+        <w:trPr>
+          <w:cantSplit/>
+        </w:trPr>
         <w:tc>
           <w:tcPr>
             <w:tcW w:w="810" w:type="dxa"/>
@@ -1835,6 +1904,9 @@
         </w:tc>
       </w:tr>
       <w:tr>
+        <w:trPr>
+          <w:cantSplit/>
+        </w:trPr>
         <w:tc>
           <w:tcPr>
             <w:tcW w:w="810" w:type="dxa"/>
@@ -1937,6 +2009,9 @@
         </w:tc>
       </w:tr>
       <w:tr>
+        <w:trPr>
+          <w:cantSplit/>
+        </w:trPr>
         <w:tc>
           <w:tcPr>
             <w:tcW w:w="810" w:type="dxa"/>
@@ -2424,7 +2499,7 @@
           <w:sz w:val="24"/>
           <w:szCs w:val="24"/>
         </w:rPr>
-        <w:t xml:space="preserve">Hasil yang dijaga: cuti diambil sesuai hak dan syarat di bagian 4, setiap cuti lewat persetujuan atau pemberitahuan sesuai jenisnya, dan pekerjaan yang ditinggalkan punya penanggung jawab pengganti.</w:t>
+        <w:t xml:space="preserve">SOP ini memastikan cuti diambil sesuai hak dan syarat di bagian 4, setiap cuti melalui persetujuan atau pemberitahuan sesuai jenisnya, dan pekerjaan yang ditinggalkan punya penanggung jawab pengganti.</w:t>
       </w:r>
     </w:p>
     <w:p>
@@ -2511,12 +2586,13 @@
           <w:sz w:val="24"/>
           <w:szCs w:val="24"/>
         </w:rPr>
-        <w:t xml:space="preserve">Dikecualikan dari SOP ini: bekerja dari rumah (Pasal 31), karena Pasal 31 ayat (1) menyebutnya bukan cuti; hari libur resmi dan upah lembur (Pasal 22 ayat (1) sampai (3)); izin datang terlambat atau meninggalkan pekerjaan pada jam kerja (Pasal 29); dan pemutusan hubungan kerja. Hanya pengecualian pertama berasal dari sumber. Sisanya diturunkan dari kriteria aturan dan alur pengajuan berbagai jenis cuti (USULAN).</w:t>
+        <w:t xml:space="preserve">Dikecualikan dari SOP ini: bekerja dari rumah (Pasal 31), karena Pasal 31 ayat (1) menyebutnya bukan cuti; hari libur resmi dan upah lembur (Pasal 22 ayat (1) sampai (3)); izin datang terlambat atau meninggalkan pekerjaan pada jam kerja (Pasal 29); dan pemutusan hubungan kerja. Hanya pengecualian pertama yang berasal dari PP - Cuti BAB VI; sisanya diturunkan dari kriteria aturan dan alur pengajuan berbagai jenis cuti (USULAN).</w:t>
       </w:r>
     </w:p>
     <w:p>
       <w:pPr>
         <w:pStyle w:val="Heading1"/>
+        <w:keepNext/>
         <w:numPr>
           <w:ilvl w:val="0"/>
           <w:numId w:val="7"/>
@@ -2551,6 +2627,8 @@
       </w:tblGrid>
       <w:tr>
         <w:trPr>
+          <w:cantSplit/>
+          <w:tblHeader/>
           <w:jc w:val="center"/>
         </w:trPr>
         <w:tc>
@@ -2560,6 +2638,7 @@
           </w:tcPr>
           <w:p>
             <w:pPr>
+              <w:keepNext/>
               <w:jc w:val="center"/>
               <w:rPr>
                 <w:sz w:val="24"/>
@@ -2584,6 +2663,7 @@
           </w:tcPr>
           <w:p>
             <w:pPr>
+              <w:keepNext/>
               <w:jc w:val="center"/>
               <w:rPr>
                 <w:sz w:val="24"/>
@@ -2604,6 +2684,7 @@
       </w:tr>
       <w:tr>
         <w:trPr>
+          <w:cantSplit/>
           <w:jc w:val="center"/>
         </w:trPr>
         <w:tc>
@@ -2653,6 +2734,7 @@
       </w:tr>
       <w:tr>
         <w:trPr>
+          <w:cantSplit/>
           <w:jc w:val="center"/>
         </w:trPr>
         <w:tc>
@@ -2702,6 +2784,7 @@
       </w:tr>
       <w:tr>
         <w:trPr>
+          <w:cantSplit/>
           <w:jc w:val="center"/>
         </w:trPr>
         <w:tc>
@@ -2751,6 +2834,7 @@
       </w:tr>
       <w:tr>
         <w:trPr>
+          <w:cantSplit/>
           <w:jc w:val="center"/>
         </w:trPr>
         <w:tc>
@@ -2793,13 +2877,14 @@
                 <w:sz w:val="24"/>
                 <w:szCs w:val="24"/>
               </w:rPr>
-              <w:t>Izin tidak masuk kerja dengan upah tetap dibayar untuk peristiwa yang tercantum di butir 4.25.</w:t>
+              <w:t>Izin tidak masuk kerja dengan upah tetap dibayar untuk peristiwa menurut butir 4.25.</w:t>
             </w:r>
           </w:p>
         </w:tc>
       </w:tr>
       <w:tr>
         <w:trPr>
+          <w:cantSplit/>
           <w:jc w:val="center"/>
         </w:trPr>
         <w:tc>
@@ -2849,6 +2934,7 @@
       </w:tr>
       <w:tr>
         <w:trPr>
+          <w:cantSplit/>
           <w:jc w:val="center"/>
         </w:trPr>
         <w:tc>
@@ -2898,6 +2984,7 @@
       </w:tr>
       <w:tr>
         <w:trPr>
+          <w:cantSplit/>
           <w:jc w:val="center"/>
         </w:trPr>
         <w:tc>
@@ -2947,6 +3034,7 @@
       </w:tr>
       <w:tr>
         <w:trPr>
+          <w:cantSplit/>
           <w:jc w:val="center"/>
         </w:trPr>
         <w:tc>
@@ -2996,6 +3084,7 @@
       </w:tr>
       <w:tr>
         <w:trPr>
+          <w:cantSplit/>
           <w:jc w:val="center"/>
         </w:trPr>
         <w:tc>
@@ -3045,6 +3134,7 @@
       </w:tr>
       <w:tr>
         <w:trPr>
+          <w:cantSplit/>
           <w:jc w:val="center"/>
         </w:trPr>
         <w:tc>
@@ -3094,6 +3184,7 @@
       </w:tr>
       <w:tr>
         <w:trPr>
+          <w:cantSplit/>
           <w:jc w:val="center"/>
         </w:trPr>
         <w:tc>
@@ -3143,6 +3234,7 @@
       </w:tr>
       <w:tr>
         <w:trPr>
+          <w:cantSplit/>
           <w:jc w:val="center"/>
         </w:trPr>
         <w:tc>
@@ -3192,6 +3284,7 @@
       </w:tr>
       <w:tr>
         <w:trPr>
+          <w:cantSplit/>
           <w:jc w:val="center"/>
         </w:trPr>
         <w:tc>
@@ -3241,6 +3334,7 @@
       </w:tr>
       <w:tr>
         <w:trPr>
+          <w:cantSplit/>
           <w:jc w:val="center"/>
         </w:trPr>
         <w:tc>
@@ -3290,6 +3384,7 @@
       </w:tr>
       <w:tr>
         <w:trPr>
+          <w:cantSplit/>
           <w:jc w:val="center"/>
         </w:trPr>
         <w:tc>
@@ -3339,6 +3434,7 @@
       </w:tr>
       <w:tr>
         <w:trPr>
+          <w:cantSplit/>
           <w:jc w:val="center"/>
         </w:trPr>
         <w:tc>
@@ -3388,6 +3484,7 @@
       </w:tr>
       <w:tr>
         <w:trPr>
+          <w:cantSplit/>
           <w:jc w:val="center"/>
         </w:trPr>
         <w:tc>
@@ -3488,7 +3585,7 @@
           <w:sz w:val="24"/>
           <w:szCs w:val="24"/>
         </w:rPr>
-        <w:t xml:space="preserve">Aturan di bagian ini diambil dari PP - Cuti BAB VI. Nomor pasal dan ayat ada di akhir tiap butir. Istilah subjek disamakan dengan bagian 3; angka, syarat, dan tenggat sama dengan sumber.</w:t>
+        <w:t xml:space="preserve">Aturan di bagian ini diambil dari PP - Cuti BAB VI, dengan nomor pasal dan ayat di akhir tiap butir. Angka, syarat, dan tenggatnya tidak diubah; hanya sebutan pihak yang disamakan dengan istilah di bagian 3.</w:t>
       </w:r>
     </w:p>
     <w:p>
@@ -3752,7 +3849,7 @@
           <w:sz w:val="24"/>
           <w:szCs w:val="24"/>
         </w:rPr>
-        <w:t xml:space="preserve">4.11 Pemanggilan kembali: bila ada kepentingan Perusahaan yang mendesak dan hanya dapat didelegasikan kepada karyawan yang sedang cuti, karyawan dapat dipanggil kembali bekerja dan wajib memenuhi panggilan itu. Cuti yang telah diambil dapat dibatalkan atau dikembalikan (Pasal 23 ayat (2) huruf l).</w:t>
+        <w:t xml:space="preserve">4.11 Pemanggilan kembali: jika ada kepentingan Perusahaan yang mendesak dan hanya dapat didelegasikan kepada karyawan yang sedang cuti, karyawan dapat dipanggil kembali bekerja dan wajib memenuhi panggilan itu. Cuti yang telah diambil dapat dibatalkan atau dikembalikan (Pasal 23 ayat (2) huruf l).</w:t>
       </w:r>
     </w:p>
     <w:p>
@@ -3920,7 +4017,7 @@
           <w:sz w:val="24"/>
           <w:szCs w:val="24"/>
         </w:rPr>
-        <w:t xml:space="preserve">4.18 Cuti melahirkan: karyawan perempuan berhak memperoleh cuti melahirkan paling singkat 3 (tiga) bulan dan dapat memperoleh tambahan paling lama 3 (tiga) bulan berikutnya bila ada kondisi khusus sebagaimana ditentukan peraturan perundang-undangan dan dibuktikan dengan surat keterangan dokter. Cuti melahirkan diambil dengan melampirkan surat dokter yang mencantumkan HPL (Pasal 26 ayat (1) dan (2)).</w:t>
+        <w:t xml:space="preserve">4.18 Cuti melahirkan: karyawan perempuan berhak memperoleh cuti melahirkan paling singkat 3 (tiga) bulan dan dapat memperoleh tambahan paling lama 3 (tiga) bulan berikutnya jika ada kondisi khusus sebagaimana ditentukan peraturan perundang-undangan dan dibuktikan dengan surat keterangan dokter. Cuti melahirkan diambil dengan melampirkan surat dokter yang mencantumkan HPL (Pasal 26 ayat (1) dan (2)).</w:t>
       </w:r>
     </w:p>
     <w:p>
@@ -4016,7 +4113,7 @@
           <w:sz w:val="24"/>
           <w:szCs w:val="24"/>
         </w:rPr>
-        <w:t xml:space="preserve">4.22 Kelahiran bayi: bila istri karyawan telah melahirkan, karyawan wajib memberi tahu kelahiran bayinya kepada HRGA Officer untuk didaftarkan dan dilakukan pengkinian tanggungan karyawan (Pasal 26 ayat (4)).</w:t>
+        <w:t xml:space="preserve">4.22 Kelahiran bayi: jika istri karyawan telah melahirkan, karyawan wajib memberi tahu kelahiran bayinya kepada HRGA Officer untuk didaftarkan dan dilakukan pengkinian tanggungan karyawan (Pasal 26 ayat (4)).</w:t>
       </w:r>
     </w:p>
     <w:p>
@@ -4064,7 +4161,7 @@
           <w:sz w:val="24"/>
           <w:szCs w:val="24"/>
         </w:rPr>
-        <w:t xml:space="preserve">4.24 Menyusui: karyawan perempuan yang anaknya masih menyusui dapat diberi kesempatan sepatutnya untuk menyusui anaknya bila harus dilakukan selama waktu kerja (Pasal 26 ayat (7)).</w:t>
+        <w:t xml:space="preserve">4.24 Menyusui: karyawan perempuan yang anaknya masih menyusui dapat diberi kesempatan sepatutnya untuk menyusui anaknya jika harus dilakukan selama waktu kerja (Pasal 26 ayat (7)).</w:t>
       </w:r>
     </w:p>
     <w:p>
@@ -4568,7 +4665,7 @@
           <w:sz w:val="24"/>
           <w:szCs w:val="24"/>
         </w:rPr>
-        <w:t xml:space="preserve">4.36 Pembagian peran (ISO 9001:2015 5.3): peran dan wewenang tiap pihak dalam SOP ini ada di bagian 5. Nama jabatan mengikuti SNX-HR-ORG-01.</w:t>
+        <w:t xml:space="preserve">4.36 Pembagian peran (ISO 9001:2015 5.3): setiap pihak dalam SOP ini menjalankan peran dan wewenang menurut bagian 5. Nama jabatan mengikuti SNX-HR-ORG-01.</w:t>
       </w:r>
     </w:p>
     <w:p>
@@ -4592,12 +4689,13 @@
           <w:sz w:val="24"/>
           <w:szCs w:val="24"/>
         </w:rPr>
-        <w:t xml:space="preserve">4.37 Rekaman cuti (ISO 9001:2015 7.5.3; Annex A 5.33 dan 5.34): permohonan cuti, surat keterangan dokter, dan surat dokter dengan HPL berklasifikasi RESTRICTED (Internal) menurut SNX-ISMS-PRO-01 (USULAN). Lokasi, pemilik, dan masa simpan ada di tabel bagian 11.</w:t>
+        <w:t xml:space="preserve">4.37 Record (rekaman) cuti (ISO 9001:2015 7.5.3; Annex A 5.33 dan 5.34): permohonan cuti, surat keterangan dokter, dan surat dokter dengan HPL berklasifikasi RESTRICTED (Internal) menurut SNX-ISMS-PRO-01 (USULAN).</w:t>
       </w:r>
     </w:p>
     <w:p>
       <w:pPr>
         <w:pStyle w:val="Heading1"/>
+        <w:keepNext/>
         <w:numPr>
           <w:ilvl w:val="0"/>
           <w:numId w:val="7"/>
@@ -4625,6 +4723,8 @@
       </w:tblGrid>
       <w:tr>
         <w:trPr>
+          <w:cantSplit/>
+          <w:tblHeader/>
           <w:jc w:val="center"/>
         </w:trPr>
         <w:tc>
@@ -4641,6 +4741,7 @@
           </w:tcPr>
           <w:p>
             <w:pPr>
+              <w:keepNext/>
               <w:jc w:val="center"/>
               <w:rPr>
                 <w:sz w:val="24"/>
@@ -4672,6 +4773,7 @@
           </w:tcPr>
           <w:p>
             <w:pPr>
+              <w:keepNext/>
               <w:jc w:val="center"/>
               <w:rPr>
                 <w:sz w:val="24"/>
@@ -4703,6 +4805,7 @@
           </w:tcPr>
           <w:p>
             <w:pPr>
+              <w:keepNext/>
               <w:jc w:val="center"/>
               <w:rPr>
                 <w:sz w:val="24"/>
@@ -4723,6 +4826,7 @@
       </w:tr>
       <w:tr>
         <w:trPr>
+          <w:cantSplit/>
           <w:jc w:val="center"/>
         </w:trPr>
         <w:tc>
@@ -4768,19 +4872,19 @@
           </w:tcPr>
           <w:p>
             <w:pPr>
-              <w:jc w:val="both"/>
-              <w:rPr>
-                <w:sz w:val="24"/>
-                <w:szCs w:val="24"/>
-              </w:rPr>
-            </w:pPr>
-            <w:r>
-              <w:rPr>
-                <w:b w:val="0"/>
-                <w:sz w:val="24"/>
-                <w:szCs w:val="24"/>
-              </w:rPr>
-              <w:t>Mengajukan permohonan cuti di sistem HR, melampirkan dokumen pendukung, menunjuk penanggung jawab pengganti, memberi tahu sakit, haid, dan kelahiran bayi, serta memenuhi panggilan kembali bekerja (butir 6.1 sampai 6.7).</w:t>
+              <w:jc w:val="left"/>
+              <w:rPr>
+                <w:sz w:val="24"/>
+                <w:szCs w:val="24"/>
+              </w:rPr>
+            </w:pPr>
+            <w:r>
+              <w:rPr>
+                <w:b w:val="0"/>
+                <w:sz w:val="24"/>
+                <w:szCs w:val="24"/>
+              </w:rPr>
+              <w:t>Mengajukan permohonan cuti di sistem HR, melampirkan dokumen pendukung, dan menunjuk penanggung jawab pengganti. Memberi tahu sakit, haid, dan kelahiran bayi, serta memenuhi panggilan kembali bekerja.</w:t>
             </w:r>
           </w:p>
         </w:tc>
@@ -4798,7 +4902,7 @@
           </w:tcPr>
           <w:p>
             <w:pPr>
-              <w:jc w:val="both"/>
+              <w:jc w:val="left"/>
               <w:rPr>
                 <w:sz w:val="24"/>
                 <w:szCs w:val="24"/>
@@ -4817,6 +4921,7 @@
       </w:tr>
       <w:tr>
         <w:trPr>
+          <w:cantSplit/>
           <w:jc w:val="center"/>
         </w:trPr>
         <w:tc>
@@ -4862,19 +4967,19 @@
           </w:tcPr>
           <w:p>
             <w:pPr>
-              <w:jc w:val="both"/>
-              <w:rPr>
-                <w:sz w:val="24"/>
-                <w:szCs w:val="24"/>
-              </w:rPr>
-            </w:pPr>
-            <w:r>
-              <w:rPr>
-                <w:b w:val="0"/>
-                <w:sz w:val="24"/>
-                <w:szCs w:val="24"/>
-              </w:rPr>
-              <w:t>Menyetujui atau menolak permohonan cuti, menyetujui cuti mendesak, menerima pemberitahuan sakit dan haid, dan memanggil kembali karyawan yang sedang cuti (USULAN, butir 6.1, 6.2, dan 6.7).</w:t>
+              <w:jc w:val="left"/>
+              <w:rPr>
+                <w:sz w:val="24"/>
+                <w:szCs w:val="24"/>
+              </w:rPr>
+            </w:pPr>
+            <w:r>
+              <w:rPr>
+                <w:b w:val="0"/>
+                <w:sz w:val="24"/>
+                <w:szCs w:val="24"/>
+              </w:rPr>
+              <w:t>Menyetujui atau menolak permohonan cuti, menyetujui cuti mendesak, menerima pemberitahuan sakit dan haid, serta memanggil kembali karyawan yang sedang cuti (USULAN).</w:t>
             </w:r>
           </w:p>
         </w:tc>
@@ -4892,7 +4997,7 @@
           </w:tcPr>
           <w:p>
             <w:pPr>
-              <w:jc w:val="both"/>
+              <w:jc w:val="left"/>
               <w:rPr>
                 <w:sz w:val="24"/>
                 <w:szCs w:val="24"/>
@@ -4911,6 +5016,7 @@
       </w:tr>
       <w:tr>
         <w:trPr>
+          <w:cantSplit/>
           <w:jc w:val="center"/>
         </w:trPr>
         <w:tc>
@@ -4956,19 +5062,19 @@
           </w:tcPr>
           <w:p>
             <w:pPr>
-              <w:jc w:val="both"/>
-              <w:rPr>
-                <w:sz w:val="24"/>
-                <w:szCs w:val="24"/>
-              </w:rPr>
-            </w:pPr>
-            <w:r>
-              <w:rPr>
-                <w:b w:val="0"/>
-                <w:sz w:val="24"/>
-                <w:szCs w:val="24"/>
-              </w:rPr>
-              <w:t>Menerima pemberitahuan sakit, haid, penundaan cuti melahirkan, dan kelahiran bayi; mencatat alfa dan cuti haid; mendaftarkan bayi sebagai tanggungan; mencatat pembatalan cuti; memegang rekaman cuti (USULAN, butir 6.3 sampai 6.7).</w:t>
+              <w:jc w:val="left"/>
+              <w:rPr>
+                <w:sz w:val="24"/>
+                <w:szCs w:val="24"/>
+              </w:rPr>
+            </w:pPr>
+            <w:r>
+              <w:rPr>
+                <w:b w:val="0"/>
+                <w:sz w:val="24"/>
+                <w:szCs w:val="24"/>
+              </w:rPr>
+              <w:t>Menerima pemberitahuan sakit, haid, penundaan cuti melahirkan, dan kelahiran bayi. Mencatat alfa, cuti haid, dan pembatalan cuti, mendaftarkan bayi sebagai tanggungan, serta memegang record cuti (USULAN).</w:t>
             </w:r>
           </w:p>
         </w:tc>
@@ -4986,7 +5092,7 @@
           </w:tcPr>
           <w:p>
             <w:pPr>
-              <w:jc w:val="both"/>
+              <w:jc w:val="left"/>
               <w:rPr>
                 <w:sz w:val="24"/>
                 <w:szCs w:val="24"/>
@@ -5005,6 +5111,7 @@
       </w:tr>
       <w:tr>
         <w:trPr>
+          <w:cantSplit/>
           <w:jc w:val="center"/>
         </w:trPr>
         <w:tc>
@@ -5050,19 +5157,19 @@
           </w:tcPr>
           <w:p>
             <w:pPr>
-              <w:jc w:val="both"/>
-              <w:rPr>
-                <w:sz w:val="24"/>
-                <w:szCs w:val="24"/>
-              </w:rPr>
-            </w:pPr>
-            <w:r>
-              <w:rPr>
-                <w:b w:val="0"/>
-                <w:sz w:val="24"/>
-                <w:szCs w:val="24"/>
-              </w:rPr>
-              <w:t>Pemilik SOP. Memutuskan atas nama Perusahaan: cuti tanpa dibayar, lama cuti musibah, persetujuan surat keterangan dokter sakit berkepanjangan, tahap upah sakit berkepanjangan, dan sanksi alfa (USULAN, butir 6.1, 6.4, dan bagian 9).</w:t>
+              <w:jc w:val="left"/>
+              <w:rPr>
+                <w:sz w:val="24"/>
+                <w:szCs w:val="24"/>
+              </w:rPr>
+            </w:pPr>
+            <w:r>
+              <w:rPr>
+                <w:b w:val="0"/>
+                <w:sz w:val="24"/>
+                <w:szCs w:val="24"/>
+              </w:rPr>
+              <w:t>Pemilik SOP. Atas nama Perusahaan, memutuskan cuti tanpa dibayar, lama cuti musibah, persetujuan surat keterangan dokter sakit berkepanjangan, tahap upah sakit berkepanjangan, dan sanksi alfa (USULAN).</w:t>
             </w:r>
           </w:p>
         </w:tc>
@@ -5080,7 +5187,7 @@
           </w:tcPr>
           <w:p>
             <w:pPr>
-              <w:jc w:val="both"/>
+              <w:jc w:val="left"/>
               <w:rPr>
                 <w:sz w:val="24"/>
                 <w:szCs w:val="24"/>
@@ -5099,6 +5206,7 @@
       </w:tr>
       <w:tr>
         <w:trPr>
+          <w:cantSplit/>
           <w:jc w:val="center"/>
         </w:trPr>
         <w:tc>
@@ -5144,19 +5252,19 @@
           </w:tcPr>
           <w:p>
             <w:pPr>
-              <w:jc w:val="both"/>
-              <w:rPr>
-                <w:sz w:val="24"/>
-                <w:szCs w:val="24"/>
-              </w:rPr>
-            </w:pPr>
-            <w:r>
-              <w:rPr>
-                <w:b w:val="0"/>
-                <w:sz w:val="24"/>
-                <w:szCs w:val="24"/>
-              </w:rPr>
-              <w:t>Menunda cuti karyawan untuk kepentingan Perusahaan dan menyetujui lama cuti kompensasi (butir 6.7).</w:t>
+              <w:jc w:val="left"/>
+              <w:rPr>
+                <w:sz w:val="24"/>
+                <w:szCs w:val="24"/>
+              </w:rPr>
+            </w:pPr>
+            <w:r>
+              <w:rPr>
+                <w:b w:val="0"/>
+                <w:sz w:val="24"/>
+                <w:szCs w:val="24"/>
+              </w:rPr>
+              <w:t>Menunda cuti karyawan untuk kepentingan Perusahaan dan menyetujui lama cuti kompensasi.</w:t>
             </w:r>
           </w:p>
         </w:tc>
@@ -5174,7 +5282,7 @@
           </w:tcPr>
           <w:p>
             <w:pPr>
-              <w:jc w:val="both"/>
+              <w:jc w:val="left"/>
               <w:rPr>
                 <w:sz w:val="24"/>
                 <w:szCs w:val="24"/>
@@ -5240,6 +5348,7 @@
     </w:p>
     <w:p>
       <w:pPr>
+        <w:keepNext/>
         <w:pBdr>
           <w:top w:val="nil"/>
           <w:left w:val="nil"/>
@@ -5259,7 +5368,7 @@
           <w:sz w:val="24"/>
           <w:szCs w:val="24"/>
         </w:rPr>
-        <w:t xml:space="preserve">Alur ini berlaku untuk cuti yang dijadwalkan: cuti tahunan, cuti ulang tahun, cuti khusus, cuti melahirkan dan pendampingan istri, cuti ibadah, dan cuti tanpa dibayar. Pasal 32 ayat (1) tidak merinci jenis cuti; penerapannya ke cuti melahirkan, cuti ibadah, dan cuti tanpa dibayar adalah USULAN. Cuti mendesak ada di 6.2, cuti sakit di 6.3, dan cuti haid di 6.5.</w:t>
+        <w:t xml:space="preserve">Alur ini berlaku untuk cuti yang dijadwalkan: cuti tahunan, cuti ulang tahun, cuti khusus, cuti melahirkan dan pendampingan istri, cuti ibadah, dan cuti tanpa dibayar. Pasal 32 ayat (1) tidak merinci jenis cuti, jadi penerapannya ke cuti melahirkan, cuti ibadah, dan cuti tanpa dibayar masih USULAN. Cuti mendesak, cuti sakit, dan cuti haid memakai alur 6.2, 6.3, dan 6.5.</w:t>
       </w:r>
     </w:p>
     <w:tbl>
@@ -5272,27 +5381,30 @@
         <w:tblLook w:val="0400" w:firstRow="0" w:lastRow="0" w:firstColumn="0" w:lastColumn="0" w:noHBand="0" w:noVBand="1"/>
       </w:tblPr>
       <w:tblGrid>
-        <w:gridCol w:w="3367"/>
-        <w:gridCol w:w="2248"/>
-        <w:gridCol w:w="3913"/>
+        <w:gridCol w:w="4309"/>
+        <w:gridCol w:w="1927"/>
+        <w:gridCol w:w="2835"/>
       </w:tblGrid>
       <w:tr>
         <w:trPr>
+          <w:cantSplit/>
+          <w:tblHeader/>
           <w:jc w:val="center"/>
         </w:trPr>
         <w:tc>
           <w:tcPr>
-            <w:tcW w:w="3367" w:type="dxa"/>
-            <w:tcBorders>
-              <w:top w:val="single" w:sz="8" w:space="0" w:color="000000"/>
-              <w:left w:val="single" w:sz="8" w:space="0" w:color="000000"/>
-              <w:bottom w:val="single" w:sz="8" w:space="0" w:color="000000"/>
-              <w:right w:val="single" w:sz="8" w:space="0" w:color="000000"/>
-            </w:tcBorders>
-            <w:vAlign w:val="center"/>
-          </w:tcPr>
-          <w:p>
-            <w:pPr>
+            <w:tcW w:w="4309" w:type="dxa"/>
+            <w:tcBorders>
+              <w:top w:val="single" w:sz="8" w:space="0" w:color="000000"/>
+              <w:left w:val="single" w:sz="8" w:space="0" w:color="000000"/>
+              <w:bottom w:val="single" w:sz="8" w:space="0" w:color="000000"/>
+              <w:right w:val="single" w:sz="8" w:space="0" w:color="000000"/>
+            </w:tcBorders>
+            <w:vAlign w:val="center"/>
+          </w:tcPr>
+          <w:p>
+            <w:pPr>
+              <w:keepNext/>
               <w:jc w:val="center"/>
               <w:rPr>
                 <w:sz w:val="24"/>
@@ -5312,17 +5424,18 @@
         </w:tc>
         <w:tc>
           <w:tcPr>
-            <w:tcW w:w="2248" w:type="dxa"/>
-            <w:tcBorders>
-              <w:top w:val="single" w:sz="8" w:space="0" w:color="000000"/>
-              <w:left w:val="single" w:sz="8" w:space="0" w:color="000000"/>
-              <w:bottom w:val="single" w:sz="8" w:space="0" w:color="000000"/>
-              <w:right w:val="single" w:sz="8" w:space="0" w:color="000000"/>
-            </w:tcBorders>
-            <w:vAlign w:val="center"/>
-          </w:tcPr>
-          <w:p>
-            <w:pPr>
+            <w:tcW w:w="1927" w:type="dxa"/>
+            <w:tcBorders>
+              <w:top w:val="single" w:sz="8" w:space="0" w:color="000000"/>
+              <w:left w:val="single" w:sz="8" w:space="0" w:color="000000"/>
+              <w:bottom w:val="single" w:sz="8" w:space="0" w:color="000000"/>
+              <w:right w:val="single" w:sz="8" w:space="0" w:color="000000"/>
+            </w:tcBorders>
+            <w:vAlign w:val="center"/>
+          </w:tcPr>
+          <w:p>
+            <w:pPr>
+              <w:keepNext/>
               <w:jc w:val="center"/>
               <w:rPr>
                 <w:sz w:val="24"/>
@@ -5342,17 +5455,18 @@
         </w:tc>
         <w:tc>
           <w:tcPr>
-            <w:tcW w:w="3913" w:type="dxa"/>
-            <w:tcBorders>
-              <w:top w:val="single" w:sz="8" w:space="0" w:color="000000"/>
-              <w:left w:val="single" w:sz="8" w:space="0" w:color="000000"/>
-              <w:bottom w:val="single" w:sz="8" w:space="0" w:color="000000"/>
-              <w:right w:val="single" w:sz="8" w:space="0" w:color="000000"/>
-            </w:tcBorders>
-            <w:vAlign w:val="center"/>
-          </w:tcPr>
-          <w:p>
-            <w:pPr>
+            <w:tcW w:w="2835" w:type="dxa"/>
+            <w:tcBorders>
+              <w:top w:val="single" w:sz="8" w:space="0" w:color="000000"/>
+              <w:left w:val="single" w:sz="8" w:space="0" w:color="000000"/>
+              <w:bottom w:val="single" w:sz="8" w:space="0" w:color="000000"/>
+              <w:right w:val="single" w:sz="8" w:space="0" w:color="000000"/>
+            </w:tcBorders>
+            <w:vAlign w:val="center"/>
+          </w:tcPr>
+          <w:p>
+            <w:pPr>
+              <w:keepNext/>
               <w:jc w:val="center"/>
               <w:rPr>
                 <w:sz w:val="24"/>
@@ -5373,11 +5487,12 @@
       </w:tr>
       <w:tr>
         <w:trPr>
+          <w:cantSplit/>
           <w:jc w:val="center"/>
         </w:trPr>
         <w:tc>
           <w:tcPr>
-            <w:tcW w:w="3367" w:type="dxa"/>
+            <w:tcW w:w="4309" w:type="dxa"/>
             <w:tcBorders>
               <w:top w:val="single" w:sz="8" w:space="0" w:color="000000"/>
               <w:left w:val="single" w:sz="8" w:space="0" w:color="000000"/>
@@ -5405,7 +5520,7 @@
         </w:tc>
         <w:tc>
           <w:tcPr>
-            <w:tcW w:w="2248" w:type="dxa"/>
+            <w:tcW w:w="1927" w:type="dxa"/>
             <w:tcBorders>
               <w:top w:val="single" w:sz="8" w:space="0" w:color="000000"/>
               <w:left w:val="single" w:sz="8" w:space="0" w:color="000000"/>
@@ -5433,18 +5548,18 @@
         </w:tc>
         <w:tc>
           <w:tcPr>
-            <w:tcW w:w="3913" w:type="dxa"/>
-            <w:tcBorders>
-              <w:top w:val="single" w:sz="8" w:space="0" w:color="000000"/>
-              <w:left w:val="single" w:sz="8" w:space="0" w:color="000000"/>
-              <w:bottom w:val="single" w:sz="8" w:space="0" w:color="000000"/>
-              <w:right w:val="single" w:sz="8" w:space="0" w:color="000000"/>
-            </w:tcBorders>
-            <w:vAlign w:val="center"/>
-          </w:tcPr>
-          <w:p>
-            <w:pPr>
-              <w:jc w:val="both"/>
+            <w:tcW w:w="2835" w:type="dxa"/>
+            <w:tcBorders>
+              <w:top w:val="single" w:sz="8" w:space="0" w:color="000000"/>
+              <w:left w:val="single" w:sz="8" w:space="0" w:color="000000"/>
+              <w:bottom w:val="single" w:sz="8" w:space="0" w:color="000000"/>
+              <w:right w:val="single" w:sz="8" w:space="0" w:color="000000"/>
+            </w:tcBorders>
+            <w:vAlign w:val="center"/>
+          </w:tcPr>
+          <w:p>
+            <w:pPr>
+              <w:jc w:val="left"/>
               <w:rPr>
                 <w:sz w:val="24"/>
                 <w:szCs w:val="24"/>
@@ -5463,11 +5578,12 @@
       </w:tr>
       <w:tr>
         <w:trPr>
+          <w:cantSplit/>
           <w:jc w:val="center"/>
         </w:trPr>
         <w:tc>
           <w:tcPr>
-            <w:tcW w:w="3367" w:type="dxa"/>
+            <w:tcW w:w="4309" w:type="dxa"/>
             <w:tcBorders>
               <w:top w:val="single" w:sz="8" w:space="0" w:color="000000"/>
               <w:left w:val="single" w:sz="8" w:space="0" w:color="000000"/>
@@ -5495,7 +5611,7 @@
         </w:tc>
         <w:tc>
           <w:tcPr>
-            <w:tcW w:w="2248" w:type="dxa"/>
+            <w:tcW w:w="1927" w:type="dxa"/>
             <w:tcBorders>
               <w:top w:val="single" w:sz="8" w:space="0" w:color="000000"/>
               <w:left w:val="single" w:sz="8" w:space="0" w:color="000000"/>
@@ -5523,18 +5639,18 @@
         </w:tc>
         <w:tc>
           <w:tcPr>
-            <w:tcW w:w="3913" w:type="dxa"/>
-            <w:tcBorders>
-              <w:top w:val="single" w:sz="8" w:space="0" w:color="000000"/>
-              <w:left w:val="single" w:sz="8" w:space="0" w:color="000000"/>
-              <w:bottom w:val="single" w:sz="8" w:space="0" w:color="000000"/>
-              <w:right w:val="single" w:sz="8" w:space="0" w:color="000000"/>
-            </w:tcBorders>
-            <w:vAlign w:val="center"/>
-          </w:tcPr>
-          <w:p>
-            <w:pPr>
-              <w:jc w:val="both"/>
+            <w:tcW w:w="2835" w:type="dxa"/>
+            <w:tcBorders>
+              <w:top w:val="single" w:sz="8" w:space="0" w:color="000000"/>
+              <w:left w:val="single" w:sz="8" w:space="0" w:color="000000"/>
+              <w:bottom w:val="single" w:sz="8" w:space="0" w:color="000000"/>
+              <w:right w:val="single" w:sz="8" w:space="0" w:color="000000"/>
+            </w:tcBorders>
+            <w:vAlign w:val="center"/>
+          </w:tcPr>
+          <w:p>
+            <w:pPr>
+              <w:jc w:val="left"/>
               <w:rPr>
                 <w:sz w:val="24"/>
                 <w:szCs w:val="24"/>
@@ -5553,11 +5669,12 @@
       </w:tr>
       <w:tr>
         <w:trPr>
+          <w:cantSplit/>
           <w:jc w:val="center"/>
         </w:trPr>
         <w:tc>
           <w:tcPr>
-            <w:tcW w:w="3367" w:type="dxa"/>
+            <w:tcW w:w="4309" w:type="dxa"/>
             <w:tcBorders>
               <w:top w:val="single" w:sz="8" w:space="0" w:color="000000"/>
               <w:left w:val="single" w:sz="8" w:space="0" w:color="000000"/>
@@ -5585,7 +5702,7 @@
         </w:tc>
         <w:tc>
           <w:tcPr>
-            <w:tcW w:w="2248" w:type="dxa"/>
+            <w:tcW w:w="1927" w:type="dxa"/>
             <w:tcBorders>
               <w:top w:val="single" w:sz="8" w:space="0" w:color="000000"/>
               <w:left w:val="single" w:sz="8" w:space="0" w:color="000000"/>
@@ -5613,18 +5730,18 @@
         </w:tc>
         <w:tc>
           <w:tcPr>
-            <w:tcW w:w="3913" w:type="dxa"/>
-            <w:tcBorders>
-              <w:top w:val="single" w:sz="8" w:space="0" w:color="000000"/>
-              <w:left w:val="single" w:sz="8" w:space="0" w:color="000000"/>
-              <w:bottom w:val="single" w:sz="8" w:space="0" w:color="000000"/>
-              <w:right w:val="single" w:sz="8" w:space="0" w:color="000000"/>
-            </w:tcBorders>
-            <w:vAlign w:val="center"/>
-          </w:tcPr>
-          <w:p>
-            <w:pPr>
-              <w:jc w:val="both"/>
+            <w:tcW w:w="2835" w:type="dxa"/>
+            <w:tcBorders>
+              <w:top w:val="single" w:sz="8" w:space="0" w:color="000000"/>
+              <w:left w:val="single" w:sz="8" w:space="0" w:color="000000"/>
+              <w:bottom w:val="single" w:sz="8" w:space="0" w:color="000000"/>
+              <w:right w:val="single" w:sz="8" w:space="0" w:color="000000"/>
+            </w:tcBorders>
+            <w:vAlign w:val="center"/>
+          </w:tcPr>
+          <w:p>
+            <w:pPr>
+              <w:jc w:val="left"/>
               <w:rPr>
                 <w:sz w:val="24"/>
                 <w:szCs w:val="24"/>
@@ -5643,11 +5760,12 @@
       </w:tr>
       <w:tr>
         <w:trPr>
+          <w:cantSplit/>
           <w:jc w:val="center"/>
         </w:trPr>
         <w:tc>
           <w:tcPr>
-            <w:tcW w:w="3367" w:type="dxa"/>
+            <w:tcW w:w="4309" w:type="dxa"/>
             <w:tcBorders>
               <w:top w:val="single" w:sz="8" w:space="0" w:color="000000"/>
               <w:left w:val="single" w:sz="8" w:space="0" w:color="000000"/>
@@ -5675,7 +5793,7 @@
         </w:tc>
         <w:tc>
           <w:tcPr>
-            <w:tcW w:w="2248" w:type="dxa"/>
+            <w:tcW w:w="1927" w:type="dxa"/>
             <w:tcBorders>
               <w:top w:val="single" w:sz="8" w:space="0" w:color="000000"/>
               <w:left w:val="single" w:sz="8" w:space="0" w:color="000000"/>
@@ -5703,18 +5821,18 @@
         </w:tc>
         <w:tc>
           <w:tcPr>
-            <w:tcW w:w="3913" w:type="dxa"/>
-            <w:tcBorders>
-              <w:top w:val="single" w:sz="8" w:space="0" w:color="000000"/>
-              <w:left w:val="single" w:sz="8" w:space="0" w:color="000000"/>
-              <w:bottom w:val="single" w:sz="8" w:space="0" w:color="000000"/>
-              <w:right w:val="single" w:sz="8" w:space="0" w:color="000000"/>
-            </w:tcBorders>
-            <w:vAlign w:val="center"/>
-          </w:tcPr>
-          <w:p>
-            <w:pPr>
-              <w:jc w:val="both"/>
+            <w:tcW w:w="2835" w:type="dxa"/>
+            <w:tcBorders>
+              <w:top w:val="single" w:sz="8" w:space="0" w:color="000000"/>
+              <w:left w:val="single" w:sz="8" w:space="0" w:color="000000"/>
+              <w:bottom w:val="single" w:sz="8" w:space="0" w:color="000000"/>
+              <w:right w:val="single" w:sz="8" w:space="0" w:color="000000"/>
+            </w:tcBorders>
+            <w:vAlign w:val="center"/>
+          </w:tcPr>
+          <w:p>
+            <w:pPr>
+              <w:jc w:val="left"/>
               <w:rPr>
                 <w:sz w:val="24"/>
                 <w:szCs w:val="24"/>
@@ -5733,11 +5851,12 @@
       </w:tr>
       <w:tr>
         <w:trPr>
+          <w:cantSplit/>
           <w:jc w:val="center"/>
         </w:trPr>
         <w:tc>
           <w:tcPr>
-            <w:tcW w:w="3367" w:type="dxa"/>
+            <w:tcW w:w="4309" w:type="dxa"/>
             <w:tcBorders>
               <w:top w:val="single" w:sz="8" w:space="0" w:color="000000"/>
               <w:left w:val="single" w:sz="8" w:space="0" w:color="000000"/>
@@ -5765,7 +5884,7 @@
         </w:tc>
         <w:tc>
           <w:tcPr>
-            <w:tcW w:w="2248" w:type="dxa"/>
+            <w:tcW w:w="1927" w:type="dxa"/>
             <w:tcBorders>
               <w:top w:val="single" w:sz="8" w:space="0" w:color="000000"/>
               <w:left w:val="single" w:sz="8" w:space="0" w:color="000000"/>
@@ -5793,18 +5912,18 @@
         </w:tc>
         <w:tc>
           <w:tcPr>
-            <w:tcW w:w="3913" w:type="dxa"/>
-            <w:tcBorders>
-              <w:top w:val="single" w:sz="8" w:space="0" w:color="000000"/>
-              <w:left w:val="single" w:sz="8" w:space="0" w:color="000000"/>
-              <w:bottom w:val="single" w:sz="8" w:space="0" w:color="000000"/>
-              <w:right w:val="single" w:sz="8" w:space="0" w:color="000000"/>
-            </w:tcBorders>
-            <w:vAlign w:val="center"/>
-          </w:tcPr>
-          <w:p>
-            <w:pPr>
-              <w:jc w:val="both"/>
+            <w:tcW w:w="2835" w:type="dxa"/>
+            <w:tcBorders>
+              <w:top w:val="single" w:sz="8" w:space="0" w:color="000000"/>
+              <w:left w:val="single" w:sz="8" w:space="0" w:color="000000"/>
+              <w:bottom w:val="single" w:sz="8" w:space="0" w:color="000000"/>
+              <w:right w:val="single" w:sz="8" w:space="0" w:color="000000"/>
+            </w:tcBorders>
+            <w:vAlign w:val="center"/>
+          </w:tcPr>
+          <w:p>
+            <w:pPr>
+              <w:jc w:val="left"/>
               <w:rPr>
                 <w:sz w:val="24"/>
                 <w:szCs w:val="24"/>
@@ -5823,11 +5942,12 @@
       </w:tr>
       <w:tr>
         <w:trPr>
+          <w:cantSplit/>
           <w:jc w:val="center"/>
         </w:trPr>
         <w:tc>
           <w:tcPr>
-            <w:tcW w:w="3367" w:type="dxa"/>
+            <w:tcW w:w="4309" w:type="dxa"/>
             <w:tcBorders>
               <w:top w:val="single" w:sz="8" w:space="0" w:color="000000"/>
               <w:left w:val="single" w:sz="8" w:space="0" w:color="000000"/>
@@ -5855,7 +5975,7 @@
         </w:tc>
         <w:tc>
           <w:tcPr>
-            <w:tcW w:w="2248" w:type="dxa"/>
+            <w:tcW w:w="1927" w:type="dxa"/>
             <w:tcBorders>
               <w:top w:val="single" w:sz="8" w:space="0" w:color="000000"/>
               <w:left w:val="single" w:sz="8" w:space="0" w:color="000000"/>
@@ -5883,18 +6003,18 @@
         </w:tc>
         <w:tc>
           <w:tcPr>
-            <w:tcW w:w="3913" w:type="dxa"/>
-            <w:tcBorders>
-              <w:top w:val="single" w:sz="8" w:space="0" w:color="000000"/>
-              <w:left w:val="single" w:sz="8" w:space="0" w:color="000000"/>
-              <w:bottom w:val="single" w:sz="8" w:space="0" w:color="000000"/>
-              <w:right w:val="single" w:sz="8" w:space="0" w:color="000000"/>
-            </w:tcBorders>
-            <w:vAlign w:val="center"/>
-          </w:tcPr>
-          <w:p>
-            <w:pPr>
-              <w:jc w:val="both"/>
+            <w:tcW w:w="2835" w:type="dxa"/>
+            <w:tcBorders>
+              <w:top w:val="single" w:sz="8" w:space="0" w:color="000000"/>
+              <w:left w:val="single" w:sz="8" w:space="0" w:color="000000"/>
+              <w:bottom w:val="single" w:sz="8" w:space="0" w:color="000000"/>
+              <w:right w:val="single" w:sz="8" w:space="0" w:color="000000"/>
+            </w:tcBorders>
+            <w:vAlign w:val="center"/>
+          </w:tcPr>
+          <w:p>
+            <w:pPr>
+              <w:jc w:val="left"/>
               <w:rPr>
                 <w:sz w:val="24"/>
                 <w:szCs w:val="24"/>
@@ -5913,39 +6033,40 @@
       </w:tr>
       <w:tr>
         <w:trPr>
+          <w:cantSplit/>
           <w:jc w:val="center"/>
         </w:trPr>
         <w:tc>
           <w:tcPr>
-            <w:tcW w:w="3367" w:type="dxa"/>
-            <w:tcBorders>
-              <w:top w:val="single" w:sz="8" w:space="0" w:color="000000"/>
-              <w:left w:val="single" w:sz="8" w:space="0" w:color="000000"/>
-              <w:bottom w:val="single" w:sz="8" w:space="0" w:color="000000"/>
-              <w:right w:val="single" w:sz="8" w:space="0" w:color="000000"/>
-            </w:tcBorders>
-            <w:vAlign w:val="center"/>
-          </w:tcPr>
-          <w:p>
-            <w:pPr>
-              <w:rPr>
-                <w:sz w:val="24"/>
-                <w:szCs w:val="24"/>
-              </w:rPr>
-            </w:pPr>
-            <w:r>
-              <w:rPr>
-                <w:b w:val="0"/>
-                <w:sz w:val="24"/>
-                <w:szCs w:val="24"/>
-              </w:rPr>
-              <w:t>7. Ambil cuti sesudah permohonan disetujui.</w:t>
-            </w:r>
-          </w:p>
-        </w:tc>
-        <w:tc>
-          <w:tcPr>
-            <w:tcW w:w="2248" w:type="dxa"/>
+            <w:tcW w:w="4309" w:type="dxa"/>
+            <w:tcBorders>
+              <w:top w:val="single" w:sz="8" w:space="0" w:color="000000"/>
+              <w:left w:val="single" w:sz="8" w:space="0" w:color="000000"/>
+              <w:bottom w:val="single" w:sz="8" w:space="0" w:color="000000"/>
+              <w:right w:val="single" w:sz="8" w:space="0" w:color="000000"/>
+            </w:tcBorders>
+            <w:vAlign w:val="center"/>
+          </w:tcPr>
+          <w:p>
+            <w:pPr>
+              <w:rPr>
+                <w:sz w:val="24"/>
+                <w:szCs w:val="24"/>
+              </w:rPr>
+            </w:pPr>
+            <w:r>
+              <w:rPr>
+                <w:b w:val="0"/>
+                <w:sz w:val="24"/>
+                <w:szCs w:val="24"/>
+              </w:rPr>
+              <w:t>7. Ambil cuti setelah permohonan disetujui.</w:t>
+            </w:r>
+          </w:p>
+        </w:tc>
+        <w:tc>
+          <w:tcPr>
+            <w:tcW w:w="1927" w:type="dxa"/>
             <w:tcBorders>
               <w:top w:val="single" w:sz="8" w:space="0" w:color="000000"/>
               <w:left w:val="single" w:sz="8" w:space="0" w:color="000000"/>
@@ -5973,18 +6094,18 @@
         </w:tc>
         <w:tc>
           <w:tcPr>
-            <w:tcW w:w="3913" w:type="dxa"/>
-            <w:tcBorders>
-              <w:top w:val="single" w:sz="8" w:space="0" w:color="000000"/>
-              <w:left w:val="single" w:sz="8" w:space="0" w:color="000000"/>
-              <w:bottom w:val="single" w:sz="8" w:space="0" w:color="000000"/>
-              <w:right w:val="single" w:sz="8" w:space="0" w:color="000000"/>
-            </w:tcBorders>
-            <w:vAlign w:val="center"/>
-          </w:tcPr>
-          <w:p>
-            <w:pPr>
-              <w:jc w:val="both"/>
+            <w:tcW w:w="2835" w:type="dxa"/>
+            <w:tcBorders>
+              <w:top w:val="single" w:sz="8" w:space="0" w:color="000000"/>
+              <w:left w:val="single" w:sz="8" w:space="0" w:color="000000"/>
+              <w:bottom w:val="single" w:sz="8" w:space="0" w:color="000000"/>
+              <w:right w:val="single" w:sz="8" w:space="0" w:color="000000"/>
+            </w:tcBorders>
+            <w:vAlign w:val="center"/>
+          </w:tcPr>
+          <w:p>
+            <w:pPr>
+              <w:jc w:val="left"/>
               <w:rPr>
                 <w:sz w:val="24"/>
                 <w:szCs w:val="24"/>
@@ -6041,6 +6162,7 @@
     </w:p>
     <w:p>
       <w:pPr>
+        <w:keepNext/>
         <w:pBdr>
           <w:top w:val="nil"/>
           <w:left w:val="nil"/>
@@ -6060,7 +6182,7 @@
           <w:sz w:val="24"/>
           <w:szCs w:val="24"/>
         </w:rPr>
-        <w:t xml:space="preserve">Alur ini dipakai bila kondisi di butir 4.9 terjadi, sehingga tenggat butir 4.7 tidak dapat dipenuhi.</w:t>
+        <w:t xml:space="preserve">Alur ini dipakai jika kondisi di butir 4.9 terjadi, sehingga tenggat butir 4.7 tidak dapat dipenuhi.</w:t>
       </w:r>
     </w:p>
     <w:tbl>
@@ -6073,27 +6195,30 @@
         <w:tblLook w:val="0400" w:firstRow="0" w:lastRow="0" w:firstColumn="0" w:lastColumn="0" w:noHBand="0" w:noVBand="1"/>
       </w:tblPr>
       <w:tblGrid>
-        <w:gridCol w:w="3367"/>
-        <w:gridCol w:w="2248"/>
-        <w:gridCol w:w="3913"/>
+        <w:gridCol w:w="4309"/>
+        <w:gridCol w:w="1927"/>
+        <w:gridCol w:w="2835"/>
       </w:tblGrid>
       <w:tr>
         <w:trPr>
+          <w:cantSplit/>
+          <w:tblHeader/>
           <w:jc w:val="center"/>
         </w:trPr>
         <w:tc>
           <w:tcPr>
-            <w:tcW w:w="3367" w:type="dxa"/>
-            <w:tcBorders>
-              <w:top w:val="single" w:sz="8" w:space="0" w:color="000000"/>
-              <w:left w:val="single" w:sz="8" w:space="0" w:color="000000"/>
-              <w:bottom w:val="single" w:sz="8" w:space="0" w:color="000000"/>
-              <w:right w:val="single" w:sz="8" w:space="0" w:color="000000"/>
-            </w:tcBorders>
-            <w:vAlign w:val="center"/>
-          </w:tcPr>
-          <w:p>
-            <w:pPr>
+            <w:tcW w:w="4309" w:type="dxa"/>
+            <w:tcBorders>
+              <w:top w:val="single" w:sz="8" w:space="0" w:color="000000"/>
+              <w:left w:val="single" w:sz="8" w:space="0" w:color="000000"/>
+              <w:bottom w:val="single" w:sz="8" w:space="0" w:color="000000"/>
+              <w:right w:val="single" w:sz="8" w:space="0" w:color="000000"/>
+            </w:tcBorders>
+            <w:vAlign w:val="center"/>
+          </w:tcPr>
+          <w:p>
+            <w:pPr>
+              <w:keepNext/>
               <w:jc w:val="center"/>
               <w:rPr>
                 <w:sz w:val="24"/>
@@ -6113,17 +6238,18 @@
         </w:tc>
         <w:tc>
           <w:tcPr>
-            <w:tcW w:w="2248" w:type="dxa"/>
-            <w:tcBorders>
-              <w:top w:val="single" w:sz="8" w:space="0" w:color="000000"/>
-              <w:left w:val="single" w:sz="8" w:space="0" w:color="000000"/>
-              <w:bottom w:val="single" w:sz="8" w:space="0" w:color="000000"/>
-              <w:right w:val="single" w:sz="8" w:space="0" w:color="000000"/>
-            </w:tcBorders>
-            <w:vAlign w:val="center"/>
-          </w:tcPr>
-          <w:p>
-            <w:pPr>
+            <w:tcW w:w="1927" w:type="dxa"/>
+            <w:tcBorders>
+              <w:top w:val="single" w:sz="8" w:space="0" w:color="000000"/>
+              <w:left w:val="single" w:sz="8" w:space="0" w:color="000000"/>
+              <w:bottom w:val="single" w:sz="8" w:space="0" w:color="000000"/>
+              <w:right w:val="single" w:sz="8" w:space="0" w:color="000000"/>
+            </w:tcBorders>
+            <w:vAlign w:val="center"/>
+          </w:tcPr>
+          <w:p>
+            <w:pPr>
+              <w:keepNext/>
               <w:jc w:val="center"/>
               <w:rPr>
                 <w:sz w:val="24"/>
@@ -6143,17 +6269,18 @@
         </w:tc>
         <w:tc>
           <w:tcPr>
-            <w:tcW w:w="3913" w:type="dxa"/>
-            <w:tcBorders>
-              <w:top w:val="single" w:sz="8" w:space="0" w:color="000000"/>
-              <w:left w:val="single" w:sz="8" w:space="0" w:color="000000"/>
-              <w:bottom w:val="single" w:sz="8" w:space="0" w:color="000000"/>
-              <w:right w:val="single" w:sz="8" w:space="0" w:color="000000"/>
-            </w:tcBorders>
-            <w:vAlign w:val="center"/>
-          </w:tcPr>
-          <w:p>
-            <w:pPr>
+            <w:tcW w:w="2835" w:type="dxa"/>
+            <w:tcBorders>
+              <w:top w:val="single" w:sz="8" w:space="0" w:color="000000"/>
+              <w:left w:val="single" w:sz="8" w:space="0" w:color="000000"/>
+              <w:bottom w:val="single" w:sz="8" w:space="0" w:color="000000"/>
+              <w:right w:val="single" w:sz="8" w:space="0" w:color="000000"/>
+            </w:tcBorders>
+            <w:vAlign w:val="center"/>
+          </w:tcPr>
+          <w:p>
+            <w:pPr>
+              <w:keepNext/>
               <w:jc w:val="center"/>
               <w:rPr>
                 <w:sz w:val="24"/>
@@ -6174,11 +6301,12 @@
       </w:tr>
       <w:tr>
         <w:trPr>
+          <w:cantSplit/>
           <w:jc w:val="center"/>
         </w:trPr>
         <w:tc>
           <w:tcPr>
-            <w:tcW w:w="3367" w:type="dxa"/>
+            <w:tcW w:w="4309" w:type="dxa"/>
             <w:tcBorders>
               <w:top w:val="single" w:sz="8" w:space="0" w:color="000000"/>
               <w:left w:val="single" w:sz="8" w:space="0" w:color="000000"/>
@@ -6206,7 +6334,7 @@
         </w:tc>
         <w:tc>
           <w:tcPr>
-            <w:tcW w:w="2248" w:type="dxa"/>
+            <w:tcW w:w="1927" w:type="dxa"/>
             <w:tcBorders>
               <w:top w:val="single" w:sz="8" w:space="0" w:color="000000"/>
               <w:left w:val="single" w:sz="8" w:space="0" w:color="000000"/>
@@ -6234,18 +6362,18 @@
         </w:tc>
         <w:tc>
           <w:tcPr>
-            <w:tcW w:w="3913" w:type="dxa"/>
-            <w:tcBorders>
-              <w:top w:val="single" w:sz="8" w:space="0" w:color="000000"/>
-              <w:left w:val="single" w:sz="8" w:space="0" w:color="000000"/>
-              <w:bottom w:val="single" w:sz="8" w:space="0" w:color="000000"/>
-              <w:right w:val="single" w:sz="8" w:space="0" w:color="000000"/>
-            </w:tcBorders>
-            <w:vAlign w:val="center"/>
-          </w:tcPr>
-          <w:p>
-            <w:pPr>
-              <w:jc w:val="both"/>
+            <w:tcW w:w="2835" w:type="dxa"/>
+            <w:tcBorders>
+              <w:top w:val="single" w:sz="8" w:space="0" w:color="000000"/>
+              <w:left w:val="single" w:sz="8" w:space="0" w:color="000000"/>
+              <w:bottom w:val="single" w:sz="8" w:space="0" w:color="000000"/>
+              <w:right w:val="single" w:sz="8" w:space="0" w:color="000000"/>
+            </w:tcBorders>
+            <w:vAlign w:val="center"/>
+          </w:tcPr>
+          <w:p>
+            <w:pPr>
+              <w:jc w:val="left"/>
               <w:rPr>
                 <w:sz w:val="24"/>
                 <w:szCs w:val="24"/>
@@ -6264,11 +6392,12 @@
       </w:tr>
       <w:tr>
         <w:trPr>
+          <w:cantSplit/>
           <w:jc w:val="center"/>
         </w:trPr>
         <w:tc>
           <w:tcPr>
-            <w:tcW w:w="3367" w:type="dxa"/>
+            <w:tcW w:w="4309" w:type="dxa"/>
             <w:tcBorders>
               <w:top w:val="single" w:sz="8" w:space="0" w:color="000000"/>
               <w:left w:val="single" w:sz="8" w:space="0" w:color="000000"/>
@@ -6296,7 +6425,7 @@
         </w:tc>
         <w:tc>
           <w:tcPr>
-            <w:tcW w:w="2248" w:type="dxa"/>
+            <w:tcW w:w="1927" w:type="dxa"/>
             <w:tcBorders>
               <w:top w:val="single" w:sz="8" w:space="0" w:color="000000"/>
               <w:left w:val="single" w:sz="8" w:space="0" w:color="000000"/>
@@ -6324,18 +6453,18 @@
         </w:tc>
         <w:tc>
           <w:tcPr>
-            <w:tcW w:w="3913" w:type="dxa"/>
-            <w:tcBorders>
-              <w:top w:val="single" w:sz="8" w:space="0" w:color="000000"/>
-              <w:left w:val="single" w:sz="8" w:space="0" w:color="000000"/>
-              <w:bottom w:val="single" w:sz="8" w:space="0" w:color="000000"/>
-              <w:right w:val="single" w:sz="8" w:space="0" w:color="000000"/>
-            </w:tcBorders>
-            <w:vAlign w:val="center"/>
-          </w:tcPr>
-          <w:p>
-            <w:pPr>
-              <w:jc w:val="both"/>
+            <w:tcW w:w="2835" w:type="dxa"/>
+            <w:tcBorders>
+              <w:top w:val="single" w:sz="8" w:space="0" w:color="000000"/>
+              <w:left w:val="single" w:sz="8" w:space="0" w:color="000000"/>
+              <w:bottom w:val="single" w:sz="8" w:space="0" w:color="000000"/>
+              <w:right w:val="single" w:sz="8" w:space="0" w:color="000000"/>
+            </w:tcBorders>
+            <w:vAlign w:val="center"/>
+          </w:tcPr>
+          <w:p>
+            <w:pPr>
+              <w:jc w:val="left"/>
               <w:rPr>
                 <w:sz w:val="24"/>
                 <w:szCs w:val="24"/>
@@ -6354,11 +6483,12 @@
       </w:tr>
       <w:tr>
         <w:trPr>
+          <w:cantSplit/>
           <w:jc w:val="center"/>
         </w:trPr>
         <w:tc>
           <w:tcPr>
-            <w:tcW w:w="3367" w:type="dxa"/>
+            <w:tcW w:w="4309" w:type="dxa"/>
             <w:tcBorders>
               <w:top w:val="single" w:sz="8" w:space="0" w:color="000000"/>
               <w:left w:val="single" w:sz="8" w:space="0" w:color="000000"/>
@@ -6386,7 +6516,7 @@
         </w:tc>
         <w:tc>
           <w:tcPr>
-            <w:tcW w:w="2248" w:type="dxa"/>
+            <w:tcW w:w="1927" w:type="dxa"/>
             <w:tcBorders>
               <w:top w:val="single" w:sz="8" w:space="0" w:color="000000"/>
               <w:left w:val="single" w:sz="8" w:space="0" w:color="000000"/>
@@ -6414,18 +6544,18 @@
         </w:tc>
         <w:tc>
           <w:tcPr>
-            <w:tcW w:w="3913" w:type="dxa"/>
-            <w:tcBorders>
-              <w:top w:val="single" w:sz="8" w:space="0" w:color="000000"/>
-              <w:left w:val="single" w:sz="8" w:space="0" w:color="000000"/>
-              <w:bottom w:val="single" w:sz="8" w:space="0" w:color="000000"/>
-              <w:right w:val="single" w:sz="8" w:space="0" w:color="000000"/>
-            </w:tcBorders>
-            <w:vAlign w:val="center"/>
-          </w:tcPr>
-          <w:p>
-            <w:pPr>
-              <w:jc w:val="both"/>
+            <w:tcW w:w="2835" w:type="dxa"/>
+            <w:tcBorders>
+              <w:top w:val="single" w:sz="8" w:space="0" w:color="000000"/>
+              <w:left w:val="single" w:sz="8" w:space="0" w:color="000000"/>
+              <w:bottom w:val="single" w:sz="8" w:space="0" w:color="000000"/>
+              <w:right w:val="single" w:sz="8" w:space="0" w:color="000000"/>
+            </w:tcBorders>
+            <w:vAlign w:val="center"/>
+          </w:tcPr>
+          <w:p>
+            <w:pPr>
+              <w:jc w:val="left"/>
               <w:rPr>
                 <w:sz w:val="24"/>
                 <w:szCs w:val="24"/>
@@ -6444,39 +6574,40 @@
       </w:tr>
       <w:tr>
         <w:trPr>
+          <w:cantSplit/>
           <w:jc w:val="center"/>
         </w:trPr>
         <w:tc>
           <w:tcPr>
-            <w:tcW w:w="3367" w:type="dxa"/>
-            <w:tcBorders>
-              <w:top w:val="single" w:sz="8" w:space="0" w:color="000000"/>
-              <w:left w:val="single" w:sz="8" w:space="0" w:color="000000"/>
-              <w:bottom w:val="single" w:sz="8" w:space="0" w:color="000000"/>
-              <w:right w:val="single" w:sz="8" w:space="0" w:color="000000"/>
-            </w:tcBorders>
-            <w:vAlign w:val="center"/>
-          </w:tcPr>
-          <w:p>
-            <w:pPr>
-              <w:rPr>
-                <w:sz w:val="24"/>
-                <w:szCs w:val="24"/>
-              </w:rPr>
-            </w:pPr>
-            <w:r>
-              <w:rPr>
-                <w:b w:val="0"/>
-                <w:sz w:val="24"/>
-                <w:szCs w:val="24"/>
-              </w:rPr>
-              <w:t>4. Ajukan permohonan di sistem HR sesudah persetujuan atasan langsung (USULAN).</w:t>
-            </w:r>
-          </w:p>
-        </w:tc>
-        <w:tc>
-          <w:tcPr>
-            <w:tcW w:w="2248" w:type="dxa"/>
+            <w:tcW w:w="4309" w:type="dxa"/>
+            <w:tcBorders>
+              <w:top w:val="single" w:sz="8" w:space="0" w:color="000000"/>
+              <w:left w:val="single" w:sz="8" w:space="0" w:color="000000"/>
+              <w:bottom w:val="single" w:sz="8" w:space="0" w:color="000000"/>
+              <w:right w:val="single" w:sz="8" w:space="0" w:color="000000"/>
+            </w:tcBorders>
+            <w:vAlign w:val="center"/>
+          </w:tcPr>
+          <w:p>
+            <w:pPr>
+              <w:rPr>
+                <w:sz w:val="24"/>
+                <w:szCs w:val="24"/>
+              </w:rPr>
+            </w:pPr>
+            <w:r>
+              <w:rPr>
+                <w:b w:val="0"/>
+                <w:sz w:val="24"/>
+                <w:szCs w:val="24"/>
+              </w:rPr>
+              <w:t>4. Ajukan permohonan di sistem HR setelah persetujuan atasan langsung (USULAN).</w:t>
+            </w:r>
+          </w:p>
+        </w:tc>
+        <w:tc>
+          <w:tcPr>
+            <w:tcW w:w="1927" w:type="dxa"/>
             <w:tcBorders>
               <w:top w:val="single" w:sz="8" w:space="0" w:color="000000"/>
               <w:left w:val="single" w:sz="8" w:space="0" w:color="000000"/>
@@ -6504,18 +6635,18 @@
         </w:tc>
         <w:tc>
           <w:tcPr>
-            <w:tcW w:w="3913" w:type="dxa"/>
-            <w:tcBorders>
-              <w:top w:val="single" w:sz="8" w:space="0" w:color="000000"/>
-              <w:left w:val="single" w:sz="8" w:space="0" w:color="000000"/>
-              <w:bottom w:val="single" w:sz="8" w:space="0" w:color="000000"/>
-              <w:right w:val="single" w:sz="8" w:space="0" w:color="000000"/>
-            </w:tcBorders>
-            <w:vAlign w:val="center"/>
-          </w:tcPr>
-          <w:p>
-            <w:pPr>
-              <w:jc w:val="both"/>
+            <w:tcW w:w="2835" w:type="dxa"/>
+            <w:tcBorders>
+              <w:top w:val="single" w:sz="8" w:space="0" w:color="000000"/>
+              <w:left w:val="single" w:sz="8" w:space="0" w:color="000000"/>
+              <w:bottom w:val="single" w:sz="8" w:space="0" w:color="000000"/>
+              <w:right w:val="single" w:sz="8" w:space="0" w:color="000000"/>
+            </w:tcBorders>
+            <w:vAlign w:val="center"/>
+          </w:tcPr>
+          <w:p>
+            <w:pPr>
+              <w:jc w:val="left"/>
               <w:rPr>
                 <w:sz w:val="24"/>
                 <w:szCs w:val="24"/>
@@ -6560,6 +6691,7 @@
     <w:p>
       <w:pPr>
         <w:pStyle w:val="Heading2"/>
+        <w:keepNext/>
         <w:numPr>
           <w:ilvl w:val="1"/>
           <w:numId w:val="7"/>
@@ -6580,27 +6712,30 @@
         <w:tblLook w:val="0400" w:firstRow="0" w:lastRow="0" w:firstColumn="0" w:lastColumn="0" w:noHBand="0" w:noVBand="1"/>
       </w:tblPr>
       <w:tblGrid>
-        <w:gridCol w:w="3367"/>
-        <w:gridCol w:w="2248"/>
-        <w:gridCol w:w="3913"/>
+        <w:gridCol w:w="4309"/>
+        <w:gridCol w:w="1927"/>
+        <w:gridCol w:w="2835"/>
       </w:tblGrid>
       <w:tr>
         <w:trPr>
+          <w:cantSplit/>
+          <w:tblHeader/>
           <w:jc w:val="center"/>
         </w:trPr>
         <w:tc>
           <w:tcPr>
-            <w:tcW w:w="3367" w:type="dxa"/>
-            <w:tcBorders>
-              <w:top w:val="single" w:sz="8" w:space="0" w:color="000000"/>
-              <w:left w:val="single" w:sz="8" w:space="0" w:color="000000"/>
-              <w:bottom w:val="single" w:sz="8" w:space="0" w:color="000000"/>
-              <w:right w:val="single" w:sz="8" w:space="0" w:color="000000"/>
-            </w:tcBorders>
-            <w:vAlign w:val="center"/>
-          </w:tcPr>
-          <w:p>
-            <w:pPr>
+            <w:tcW w:w="4309" w:type="dxa"/>
+            <w:tcBorders>
+              <w:top w:val="single" w:sz="8" w:space="0" w:color="000000"/>
+              <w:left w:val="single" w:sz="8" w:space="0" w:color="000000"/>
+              <w:bottom w:val="single" w:sz="8" w:space="0" w:color="000000"/>
+              <w:right w:val="single" w:sz="8" w:space="0" w:color="000000"/>
+            </w:tcBorders>
+            <w:vAlign w:val="center"/>
+          </w:tcPr>
+          <w:p>
+            <w:pPr>
+              <w:keepNext/>
               <w:jc w:val="center"/>
               <w:rPr>
                 <w:sz w:val="24"/>
@@ -6620,17 +6755,18 @@
         </w:tc>
         <w:tc>
           <w:tcPr>
-            <w:tcW w:w="2248" w:type="dxa"/>
-            <w:tcBorders>
-              <w:top w:val="single" w:sz="8" w:space="0" w:color="000000"/>
-              <w:left w:val="single" w:sz="8" w:space="0" w:color="000000"/>
-              <w:bottom w:val="single" w:sz="8" w:space="0" w:color="000000"/>
-              <w:right w:val="single" w:sz="8" w:space="0" w:color="000000"/>
-            </w:tcBorders>
-            <w:vAlign w:val="center"/>
-          </w:tcPr>
-          <w:p>
-            <w:pPr>
+            <w:tcW w:w="1927" w:type="dxa"/>
+            <w:tcBorders>
+              <w:top w:val="single" w:sz="8" w:space="0" w:color="000000"/>
+              <w:left w:val="single" w:sz="8" w:space="0" w:color="000000"/>
+              <w:bottom w:val="single" w:sz="8" w:space="0" w:color="000000"/>
+              <w:right w:val="single" w:sz="8" w:space="0" w:color="000000"/>
+            </w:tcBorders>
+            <w:vAlign w:val="center"/>
+          </w:tcPr>
+          <w:p>
+            <w:pPr>
+              <w:keepNext/>
               <w:jc w:val="center"/>
               <w:rPr>
                 <w:sz w:val="24"/>
@@ -6650,17 +6786,18 @@
         </w:tc>
         <w:tc>
           <w:tcPr>
-            <w:tcW w:w="3913" w:type="dxa"/>
-            <w:tcBorders>
-              <w:top w:val="single" w:sz="8" w:space="0" w:color="000000"/>
-              <w:left w:val="single" w:sz="8" w:space="0" w:color="000000"/>
-              <w:bottom w:val="single" w:sz="8" w:space="0" w:color="000000"/>
-              <w:right w:val="single" w:sz="8" w:space="0" w:color="000000"/>
-            </w:tcBorders>
-            <w:vAlign w:val="center"/>
-          </w:tcPr>
-          <w:p>
-            <w:pPr>
+            <w:tcW w:w="2835" w:type="dxa"/>
+            <w:tcBorders>
+              <w:top w:val="single" w:sz="8" w:space="0" w:color="000000"/>
+              <w:left w:val="single" w:sz="8" w:space="0" w:color="000000"/>
+              <w:bottom w:val="single" w:sz="8" w:space="0" w:color="000000"/>
+              <w:right w:val="single" w:sz="8" w:space="0" w:color="000000"/>
+            </w:tcBorders>
+            <w:vAlign w:val="center"/>
+          </w:tcPr>
+          <w:p>
+            <w:pPr>
+              <w:keepNext/>
               <w:jc w:val="center"/>
               <w:rPr>
                 <w:sz w:val="24"/>
@@ -6681,11 +6818,12 @@
       </w:tr>
       <w:tr>
         <w:trPr>
+          <w:cantSplit/>
           <w:jc w:val="center"/>
         </w:trPr>
         <w:tc>
           <w:tcPr>
-            <w:tcW w:w="3367" w:type="dxa"/>
+            <w:tcW w:w="4309" w:type="dxa"/>
             <w:tcBorders>
               <w:top w:val="single" w:sz="8" w:space="0" w:color="000000"/>
               <w:left w:val="single" w:sz="8" w:space="0" w:color="000000"/>
@@ -6713,7 +6851,7 @@
         </w:tc>
         <w:tc>
           <w:tcPr>
-            <w:tcW w:w="2248" w:type="dxa"/>
+            <w:tcW w:w="1927" w:type="dxa"/>
             <w:tcBorders>
               <w:top w:val="single" w:sz="8" w:space="0" w:color="000000"/>
               <w:left w:val="single" w:sz="8" w:space="0" w:color="000000"/>
@@ -6741,18 +6879,18 @@
         </w:tc>
         <w:tc>
           <w:tcPr>
-            <w:tcW w:w="3913" w:type="dxa"/>
-            <w:tcBorders>
-              <w:top w:val="single" w:sz="8" w:space="0" w:color="000000"/>
-              <w:left w:val="single" w:sz="8" w:space="0" w:color="000000"/>
-              <w:bottom w:val="single" w:sz="8" w:space="0" w:color="000000"/>
-              <w:right w:val="single" w:sz="8" w:space="0" w:color="000000"/>
-            </w:tcBorders>
-            <w:vAlign w:val="center"/>
-          </w:tcPr>
-          <w:p>
-            <w:pPr>
-              <w:jc w:val="both"/>
+            <w:tcW w:w="2835" w:type="dxa"/>
+            <w:tcBorders>
+              <w:top w:val="single" w:sz="8" w:space="0" w:color="000000"/>
+              <w:left w:val="single" w:sz="8" w:space="0" w:color="000000"/>
+              <w:bottom w:val="single" w:sz="8" w:space="0" w:color="000000"/>
+              <w:right w:val="single" w:sz="8" w:space="0" w:color="000000"/>
+            </w:tcBorders>
+            <w:vAlign w:val="center"/>
+          </w:tcPr>
+          <w:p>
+            <w:pPr>
+              <w:jc w:val="left"/>
               <w:rPr>
                 <w:sz w:val="24"/>
                 <w:szCs w:val="24"/>
@@ -6771,11 +6909,12 @@
       </w:tr>
       <w:tr>
         <w:trPr>
+          <w:cantSplit/>
           <w:jc w:val="center"/>
         </w:trPr>
         <w:tc>
           <w:tcPr>
-            <w:tcW w:w="3367" w:type="dxa"/>
+            <w:tcW w:w="4309" w:type="dxa"/>
             <w:tcBorders>
               <w:top w:val="single" w:sz="8" w:space="0" w:color="000000"/>
               <w:left w:val="single" w:sz="8" w:space="0" w:color="000000"/>
@@ -6803,7 +6942,7 @@
         </w:tc>
         <w:tc>
           <w:tcPr>
-            <w:tcW w:w="2248" w:type="dxa"/>
+            <w:tcW w:w="1927" w:type="dxa"/>
             <w:tcBorders>
               <w:top w:val="single" w:sz="8" w:space="0" w:color="000000"/>
               <w:left w:val="single" w:sz="8" w:space="0" w:color="000000"/>
@@ -6831,18 +6970,18 @@
         </w:tc>
         <w:tc>
           <w:tcPr>
-            <w:tcW w:w="3913" w:type="dxa"/>
-            <w:tcBorders>
-              <w:top w:val="single" w:sz="8" w:space="0" w:color="000000"/>
-              <w:left w:val="single" w:sz="8" w:space="0" w:color="000000"/>
-              <w:bottom w:val="single" w:sz="8" w:space="0" w:color="000000"/>
-              <w:right w:val="single" w:sz="8" w:space="0" w:color="000000"/>
-            </w:tcBorders>
-            <w:vAlign w:val="center"/>
-          </w:tcPr>
-          <w:p>
-            <w:pPr>
-              <w:jc w:val="both"/>
+            <w:tcW w:w="2835" w:type="dxa"/>
+            <w:tcBorders>
+              <w:top w:val="single" w:sz="8" w:space="0" w:color="000000"/>
+              <w:left w:val="single" w:sz="8" w:space="0" w:color="000000"/>
+              <w:bottom w:val="single" w:sz="8" w:space="0" w:color="000000"/>
+              <w:right w:val="single" w:sz="8" w:space="0" w:color="000000"/>
+            </w:tcBorders>
+            <w:vAlign w:val="center"/>
+          </w:tcPr>
+          <w:p>
+            <w:pPr>
+              <w:jc w:val="left"/>
               <w:rPr>
                 <w:sz w:val="24"/>
                 <w:szCs w:val="24"/>
@@ -6861,11 +7000,12 @@
       </w:tr>
       <w:tr>
         <w:trPr>
+          <w:cantSplit/>
           <w:jc w:val="center"/>
         </w:trPr>
         <w:tc>
           <w:tcPr>
-            <w:tcW w:w="3367" w:type="dxa"/>
+            <w:tcW w:w="4309" w:type="dxa"/>
             <w:tcBorders>
               <w:top w:val="single" w:sz="8" w:space="0" w:color="000000"/>
               <w:left w:val="single" w:sz="8" w:space="0" w:color="000000"/>
@@ -6893,7 +7033,7 @@
         </w:tc>
         <w:tc>
           <w:tcPr>
-            <w:tcW w:w="2248" w:type="dxa"/>
+            <w:tcW w:w="1927" w:type="dxa"/>
             <w:tcBorders>
               <w:top w:val="single" w:sz="8" w:space="0" w:color="000000"/>
               <w:left w:val="single" w:sz="8" w:space="0" w:color="000000"/>
@@ -6921,18 +7061,18 @@
         </w:tc>
         <w:tc>
           <w:tcPr>
-            <w:tcW w:w="3913" w:type="dxa"/>
-            <w:tcBorders>
-              <w:top w:val="single" w:sz="8" w:space="0" w:color="000000"/>
-              <w:left w:val="single" w:sz="8" w:space="0" w:color="000000"/>
-              <w:bottom w:val="single" w:sz="8" w:space="0" w:color="000000"/>
-              <w:right w:val="single" w:sz="8" w:space="0" w:color="000000"/>
-            </w:tcBorders>
-            <w:vAlign w:val="center"/>
-          </w:tcPr>
-          <w:p>
-            <w:pPr>
-              <w:jc w:val="both"/>
+            <w:tcW w:w="2835" w:type="dxa"/>
+            <w:tcBorders>
+              <w:top w:val="single" w:sz="8" w:space="0" w:color="000000"/>
+              <w:left w:val="single" w:sz="8" w:space="0" w:color="000000"/>
+              <w:bottom w:val="single" w:sz="8" w:space="0" w:color="000000"/>
+              <w:right w:val="single" w:sz="8" w:space="0" w:color="000000"/>
+            </w:tcBorders>
+            <w:vAlign w:val="center"/>
+          </w:tcPr>
+          <w:p>
+            <w:pPr>
+              <w:jc w:val="left"/>
               <w:rPr>
                 <w:sz w:val="24"/>
                 <w:szCs w:val="24"/>
@@ -6977,6 +7117,7 @@
     <w:p>
       <w:pPr>
         <w:pStyle w:val="Heading2"/>
+        <w:keepNext/>
         <w:numPr>
           <w:ilvl w:val="1"/>
           <w:numId w:val="7"/>
@@ -6997,27 +7138,30 @@
         <w:tblLook w:val="0400" w:firstRow="0" w:lastRow="0" w:firstColumn="0" w:lastColumn="0" w:noHBand="0" w:noVBand="1"/>
       </w:tblPr>
       <w:tblGrid>
-        <w:gridCol w:w="3367"/>
-        <w:gridCol w:w="2248"/>
-        <w:gridCol w:w="3913"/>
+        <w:gridCol w:w="4309"/>
+        <w:gridCol w:w="1927"/>
+        <w:gridCol w:w="2835"/>
       </w:tblGrid>
       <w:tr>
         <w:trPr>
+          <w:cantSplit/>
+          <w:tblHeader/>
           <w:jc w:val="center"/>
         </w:trPr>
         <w:tc>
           <w:tcPr>
-            <w:tcW w:w="3367" w:type="dxa"/>
-            <w:tcBorders>
-              <w:top w:val="single" w:sz="8" w:space="0" w:color="000000"/>
-              <w:left w:val="single" w:sz="8" w:space="0" w:color="000000"/>
-              <w:bottom w:val="single" w:sz="8" w:space="0" w:color="000000"/>
-              <w:right w:val="single" w:sz="8" w:space="0" w:color="000000"/>
-            </w:tcBorders>
-            <w:vAlign w:val="center"/>
-          </w:tcPr>
-          <w:p>
-            <w:pPr>
+            <w:tcW w:w="4309" w:type="dxa"/>
+            <w:tcBorders>
+              <w:top w:val="single" w:sz="8" w:space="0" w:color="000000"/>
+              <w:left w:val="single" w:sz="8" w:space="0" w:color="000000"/>
+              <w:bottom w:val="single" w:sz="8" w:space="0" w:color="000000"/>
+              <w:right w:val="single" w:sz="8" w:space="0" w:color="000000"/>
+            </w:tcBorders>
+            <w:vAlign w:val="center"/>
+          </w:tcPr>
+          <w:p>
+            <w:pPr>
+              <w:keepNext/>
               <w:jc w:val="center"/>
               <w:rPr>
                 <w:sz w:val="24"/>
@@ -7037,17 +7181,18 @@
         </w:tc>
         <w:tc>
           <w:tcPr>
-            <w:tcW w:w="2248" w:type="dxa"/>
-            <w:tcBorders>
-              <w:top w:val="single" w:sz="8" w:space="0" w:color="000000"/>
-              <w:left w:val="single" w:sz="8" w:space="0" w:color="000000"/>
-              <w:bottom w:val="single" w:sz="8" w:space="0" w:color="000000"/>
-              <w:right w:val="single" w:sz="8" w:space="0" w:color="000000"/>
-            </w:tcBorders>
-            <w:vAlign w:val="center"/>
-          </w:tcPr>
-          <w:p>
-            <w:pPr>
+            <w:tcW w:w="1927" w:type="dxa"/>
+            <w:tcBorders>
+              <w:top w:val="single" w:sz="8" w:space="0" w:color="000000"/>
+              <w:left w:val="single" w:sz="8" w:space="0" w:color="000000"/>
+              <w:bottom w:val="single" w:sz="8" w:space="0" w:color="000000"/>
+              <w:right w:val="single" w:sz="8" w:space="0" w:color="000000"/>
+            </w:tcBorders>
+            <w:vAlign w:val="center"/>
+          </w:tcPr>
+          <w:p>
+            <w:pPr>
+              <w:keepNext/>
               <w:jc w:val="center"/>
               <w:rPr>
                 <w:sz w:val="24"/>
@@ -7067,17 +7212,18 @@
         </w:tc>
         <w:tc>
           <w:tcPr>
-            <w:tcW w:w="3913" w:type="dxa"/>
-            <w:tcBorders>
-              <w:top w:val="single" w:sz="8" w:space="0" w:color="000000"/>
-              <w:left w:val="single" w:sz="8" w:space="0" w:color="000000"/>
-              <w:bottom w:val="single" w:sz="8" w:space="0" w:color="000000"/>
-              <w:right w:val="single" w:sz="8" w:space="0" w:color="000000"/>
-            </w:tcBorders>
-            <w:vAlign w:val="center"/>
-          </w:tcPr>
-          <w:p>
-            <w:pPr>
+            <w:tcW w:w="2835" w:type="dxa"/>
+            <w:tcBorders>
+              <w:top w:val="single" w:sz="8" w:space="0" w:color="000000"/>
+              <w:left w:val="single" w:sz="8" w:space="0" w:color="000000"/>
+              <w:bottom w:val="single" w:sz="8" w:space="0" w:color="000000"/>
+              <w:right w:val="single" w:sz="8" w:space="0" w:color="000000"/>
+            </w:tcBorders>
+            <w:vAlign w:val="center"/>
+          </w:tcPr>
+          <w:p>
+            <w:pPr>
+              <w:keepNext/>
               <w:jc w:val="center"/>
               <w:rPr>
                 <w:sz w:val="24"/>
@@ -7098,11 +7244,12 @@
       </w:tr>
       <w:tr>
         <w:trPr>
+          <w:cantSplit/>
           <w:jc w:val="center"/>
         </w:trPr>
         <w:tc>
           <w:tcPr>
-            <w:tcW w:w="3367" w:type="dxa"/>
+            <w:tcW w:w="4309" w:type="dxa"/>
             <w:tcBorders>
               <w:top w:val="single" w:sz="8" w:space="0" w:color="000000"/>
               <w:left w:val="single" w:sz="8" w:space="0" w:color="000000"/>
@@ -7130,7 +7277,7 @@
         </w:tc>
         <w:tc>
           <w:tcPr>
-            <w:tcW w:w="2248" w:type="dxa"/>
+            <w:tcW w:w="1927" w:type="dxa"/>
             <w:tcBorders>
               <w:top w:val="single" w:sz="8" w:space="0" w:color="000000"/>
               <w:left w:val="single" w:sz="8" w:space="0" w:color="000000"/>
@@ -7158,18 +7305,18 @@
         </w:tc>
         <w:tc>
           <w:tcPr>
-            <w:tcW w:w="3913" w:type="dxa"/>
-            <w:tcBorders>
-              <w:top w:val="single" w:sz="8" w:space="0" w:color="000000"/>
-              <w:left w:val="single" w:sz="8" w:space="0" w:color="000000"/>
-              <w:bottom w:val="single" w:sz="8" w:space="0" w:color="000000"/>
-              <w:right w:val="single" w:sz="8" w:space="0" w:color="000000"/>
-            </w:tcBorders>
-            <w:vAlign w:val="center"/>
-          </w:tcPr>
-          <w:p>
-            <w:pPr>
-              <w:jc w:val="both"/>
+            <w:tcW w:w="2835" w:type="dxa"/>
+            <w:tcBorders>
+              <w:top w:val="single" w:sz="8" w:space="0" w:color="000000"/>
+              <w:left w:val="single" w:sz="8" w:space="0" w:color="000000"/>
+              <w:bottom w:val="single" w:sz="8" w:space="0" w:color="000000"/>
+              <w:right w:val="single" w:sz="8" w:space="0" w:color="000000"/>
+            </w:tcBorders>
+            <w:vAlign w:val="center"/>
+          </w:tcPr>
+          <w:p>
+            <w:pPr>
+              <w:jc w:val="left"/>
               <w:rPr>
                 <w:sz w:val="24"/>
                 <w:szCs w:val="24"/>
@@ -7188,11 +7335,12 @@
       </w:tr>
       <w:tr>
         <w:trPr>
+          <w:cantSplit/>
           <w:jc w:val="center"/>
         </w:trPr>
         <w:tc>
           <w:tcPr>
-            <w:tcW w:w="3367" w:type="dxa"/>
+            <w:tcW w:w="4309" w:type="dxa"/>
             <w:tcBorders>
               <w:top w:val="single" w:sz="8" w:space="0" w:color="000000"/>
               <w:left w:val="single" w:sz="8" w:space="0" w:color="000000"/>
@@ -7220,7 +7368,7 @@
         </w:tc>
         <w:tc>
           <w:tcPr>
-            <w:tcW w:w="2248" w:type="dxa"/>
+            <w:tcW w:w="1927" w:type="dxa"/>
             <w:tcBorders>
               <w:top w:val="single" w:sz="8" w:space="0" w:color="000000"/>
               <w:left w:val="single" w:sz="8" w:space="0" w:color="000000"/>
@@ -7248,18 +7396,18 @@
         </w:tc>
         <w:tc>
           <w:tcPr>
-            <w:tcW w:w="3913" w:type="dxa"/>
-            <w:tcBorders>
-              <w:top w:val="single" w:sz="8" w:space="0" w:color="000000"/>
-              <w:left w:val="single" w:sz="8" w:space="0" w:color="000000"/>
-              <w:bottom w:val="single" w:sz="8" w:space="0" w:color="000000"/>
-              <w:right w:val="single" w:sz="8" w:space="0" w:color="000000"/>
-            </w:tcBorders>
-            <w:vAlign w:val="center"/>
-          </w:tcPr>
-          <w:p>
-            <w:pPr>
-              <w:jc w:val="both"/>
+            <w:tcW w:w="2835" w:type="dxa"/>
+            <w:tcBorders>
+              <w:top w:val="single" w:sz="8" w:space="0" w:color="000000"/>
+              <w:left w:val="single" w:sz="8" w:space="0" w:color="000000"/>
+              <w:bottom w:val="single" w:sz="8" w:space="0" w:color="000000"/>
+              <w:right w:val="single" w:sz="8" w:space="0" w:color="000000"/>
+            </w:tcBorders>
+            <w:vAlign w:val="center"/>
+          </w:tcPr>
+          <w:p>
+            <w:pPr>
+              <w:jc w:val="left"/>
               <w:rPr>
                 <w:sz w:val="24"/>
                 <w:szCs w:val="24"/>
@@ -7278,11 +7426,12 @@
       </w:tr>
       <w:tr>
         <w:trPr>
+          <w:cantSplit/>
           <w:jc w:val="center"/>
         </w:trPr>
         <w:tc>
           <w:tcPr>
-            <w:tcW w:w="3367" w:type="dxa"/>
+            <w:tcW w:w="4309" w:type="dxa"/>
             <w:tcBorders>
               <w:top w:val="single" w:sz="8" w:space="0" w:color="000000"/>
               <w:left w:val="single" w:sz="8" w:space="0" w:color="000000"/>
@@ -7310,7 +7459,7 @@
         </w:tc>
         <w:tc>
           <w:tcPr>
-            <w:tcW w:w="2248" w:type="dxa"/>
+            <w:tcW w:w="1927" w:type="dxa"/>
             <w:tcBorders>
               <w:top w:val="single" w:sz="8" w:space="0" w:color="000000"/>
               <w:left w:val="single" w:sz="8" w:space="0" w:color="000000"/>
@@ -7338,18 +7487,18 @@
         </w:tc>
         <w:tc>
           <w:tcPr>
-            <w:tcW w:w="3913" w:type="dxa"/>
-            <w:tcBorders>
-              <w:top w:val="single" w:sz="8" w:space="0" w:color="000000"/>
-              <w:left w:val="single" w:sz="8" w:space="0" w:color="000000"/>
-              <w:bottom w:val="single" w:sz="8" w:space="0" w:color="000000"/>
-              <w:right w:val="single" w:sz="8" w:space="0" w:color="000000"/>
-            </w:tcBorders>
-            <w:vAlign w:val="center"/>
-          </w:tcPr>
-          <w:p>
-            <w:pPr>
-              <w:jc w:val="both"/>
+            <w:tcW w:w="2835" w:type="dxa"/>
+            <w:tcBorders>
+              <w:top w:val="single" w:sz="8" w:space="0" w:color="000000"/>
+              <w:left w:val="single" w:sz="8" w:space="0" w:color="000000"/>
+              <w:bottom w:val="single" w:sz="8" w:space="0" w:color="000000"/>
+              <w:right w:val="single" w:sz="8" w:space="0" w:color="000000"/>
+            </w:tcBorders>
+            <w:vAlign w:val="center"/>
+          </w:tcPr>
+          <w:p>
+            <w:pPr>
+              <w:jc w:val="left"/>
               <w:rPr>
                 <w:sz w:val="24"/>
                 <w:szCs w:val="24"/>
@@ -7394,6 +7543,7 @@
     <w:p>
       <w:pPr>
         <w:pStyle w:val="Heading2"/>
+        <w:keepNext/>
         <w:numPr>
           <w:ilvl w:val="1"/>
           <w:numId w:val="7"/>
@@ -7414,27 +7564,30 @@
         <w:tblLook w:val="0400" w:firstRow="0" w:lastRow="0" w:firstColumn="0" w:lastColumn="0" w:noHBand="0" w:noVBand="1"/>
       </w:tblPr>
       <w:tblGrid>
-        <w:gridCol w:w="3367"/>
-        <w:gridCol w:w="2248"/>
-        <w:gridCol w:w="3913"/>
+        <w:gridCol w:w="4309"/>
+        <w:gridCol w:w="1927"/>
+        <w:gridCol w:w="2835"/>
       </w:tblGrid>
       <w:tr>
         <w:trPr>
+          <w:cantSplit/>
+          <w:tblHeader/>
           <w:jc w:val="center"/>
         </w:trPr>
         <w:tc>
           <w:tcPr>
-            <w:tcW w:w="3367" w:type="dxa"/>
-            <w:tcBorders>
-              <w:top w:val="single" w:sz="8" w:space="0" w:color="000000"/>
-              <w:left w:val="single" w:sz="8" w:space="0" w:color="000000"/>
-              <w:bottom w:val="single" w:sz="8" w:space="0" w:color="000000"/>
-              <w:right w:val="single" w:sz="8" w:space="0" w:color="000000"/>
-            </w:tcBorders>
-            <w:vAlign w:val="center"/>
-          </w:tcPr>
-          <w:p>
-            <w:pPr>
+            <w:tcW w:w="4309" w:type="dxa"/>
+            <w:tcBorders>
+              <w:top w:val="single" w:sz="8" w:space="0" w:color="000000"/>
+              <w:left w:val="single" w:sz="8" w:space="0" w:color="000000"/>
+              <w:bottom w:val="single" w:sz="8" w:space="0" w:color="000000"/>
+              <w:right w:val="single" w:sz="8" w:space="0" w:color="000000"/>
+            </w:tcBorders>
+            <w:vAlign w:val="center"/>
+          </w:tcPr>
+          <w:p>
+            <w:pPr>
+              <w:keepNext/>
               <w:jc w:val="center"/>
               <w:rPr>
                 <w:sz w:val="24"/>
@@ -7454,17 +7607,18 @@
         </w:tc>
         <w:tc>
           <w:tcPr>
-            <w:tcW w:w="2248" w:type="dxa"/>
-            <w:tcBorders>
-              <w:top w:val="single" w:sz="8" w:space="0" w:color="000000"/>
-              <w:left w:val="single" w:sz="8" w:space="0" w:color="000000"/>
-              <w:bottom w:val="single" w:sz="8" w:space="0" w:color="000000"/>
-              <w:right w:val="single" w:sz="8" w:space="0" w:color="000000"/>
-            </w:tcBorders>
-            <w:vAlign w:val="center"/>
-          </w:tcPr>
-          <w:p>
-            <w:pPr>
+            <w:tcW w:w="1927" w:type="dxa"/>
+            <w:tcBorders>
+              <w:top w:val="single" w:sz="8" w:space="0" w:color="000000"/>
+              <w:left w:val="single" w:sz="8" w:space="0" w:color="000000"/>
+              <w:bottom w:val="single" w:sz="8" w:space="0" w:color="000000"/>
+              <w:right w:val="single" w:sz="8" w:space="0" w:color="000000"/>
+            </w:tcBorders>
+            <w:vAlign w:val="center"/>
+          </w:tcPr>
+          <w:p>
+            <w:pPr>
+              <w:keepNext/>
               <w:jc w:val="center"/>
               <w:rPr>
                 <w:sz w:val="24"/>
@@ -7484,17 +7638,18 @@
         </w:tc>
         <w:tc>
           <w:tcPr>
-            <w:tcW w:w="3913" w:type="dxa"/>
-            <w:tcBorders>
-              <w:top w:val="single" w:sz="8" w:space="0" w:color="000000"/>
-              <w:left w:val="single" w:sz="8" w:space="0" w:color="000000"/>
-              <w:bottom w:val="single" w:sz="8" w:space="0" w:color="000000"/>
-              <w:right w:val="single" w:sz="8" w:space="0" w:color="000000"/>
-            </w:tcBorders>
-            <w:vAlign w:val="center"/>
-          </w:tcPr>
-          <w:p>
-            <w:pPr>
+            <w:tcW w:w="2835" w:type="dxa"/>
+            <w:tcBorders>
+              <w:top w:val="single" w:sz="8" w:space="0" w:color="000000"/>
+              <w:left w:val="single" w:sz="8" w:space="0" w:color="000000"/>
+              <w:bottom w:val="single" w:sz="8" w:space="0" w:color="000000"/>
+              <w:right w:val="single" w:sz="8" w:space="0" w:color="000000"/>
+            </w:tcBorders>
+            <w:vAlign w:val="center"/>
+          </w:tcPr>
+          <w:p>
+            <w:pPr>
+              <w:keepNext/>
               <w:jc w:val="center"/>
               <w:rPr>
                 <w:sz w:val="24"/>
@@ -7515,39 +7670,40 @@
       </w:tr>
       <w:tr>
         <w:trPr>
+          <w:cantSplit/>
           <w:jc w:val="center"/>
         </w:trPr>
         <w:tc>
           <w:tcPr>
-            <w:tcW w:w="3367" w:type="dxa"/>
-            <w:tcBorders>
-              <w:top w:val="single" w:sz="8" w:space="0" w:color="000000"/>
-              <w:left w:val="single" w:sz="8" w:space="0" w:color="000000"/>
-              <w:bottom w:val="single" w:sz="8" w:space="0" w:color="000000"/>
-              <w:right w:val="single" w:sz="8" w:space="0" w:color="000000"/>
-            </w:tcBorders>
-            <w:vAlign w:val="center"/>
-          </w:tcPr>
-          <w:p>
-            <w:pPr>
-              <w:rPr>
-                <w:sz w:val="24"/>
-                <w:szCs w:val="24"/>
-              </w:rPr>
-            </w:pPr>
-            <w:r>
-              <w:rPr>
-                <w:b w:val="0"/>
-                <w:sz w:val="24"/>
-                <w:szCs w:val="24"/>
-              </w:rPr>
-              <w:t>1. Beri tahu atasan langsung dan HRGA Officer bahwa haid terasa sakit (USULAN: sumber menyebut Perusahaan tanpa penerima).</w:t>
-            </w:r>
-          </w:p>
-        </w:tc>
-        <w:tc>
-          <w:tcPr>
-            <w:tcW w:w="2248" w:type="dxa"/>
+            <w:tcW w:w="4309" w:type="dxa"/>
+            <w:tcBorders>
+              <w:top w:val="single" w:sz="8" w:space="0" w:color="000000"/>
+              <w:left w:val="single" w:sz="8" w:space="0" w:color="000000"/>
+              <w:bottom w:val="single" w:sz="8" w:space="0" w:color="000000"/>
+              <w:right w:val="single" w:sz="8" w:space="0" w:color="000000"/>
+            </w:tcBorders>
+            <w:vAlign w:val="center"/>
+          </w:tcPr>
+          <w:p>
+            <w:pPr>
+              <w:rPr>
+                <w:sz w:val="24"/>
+                <w:szCs w:val="24"/>
+              </w:rPr>
+            </w:pPr>
+            <w:r>
+              <w:rPr>
+                <w:b w:val="0"/>
+                <w:sz w:val="24"/>
+                <w:szCs w:val="24"/>
+              </w:rPr>
+              <w:t>1. Beri tahu atasan langsung dan HRGA Officer bahwa haid terasa sakit (USULAN: PP - Cuti menyebut Perusahaan tanpa penerima).</w:t>
+            </w:r>
+          </w:p>
+        </w:tc>
+        <w:tc>
+          <w:tcPr>
+            <w:tcW w:w="1927" w:type="dxa"/>
             <w:tcBorders>
               <w:top w:val="single" w:sz="8" w:space="0" w:color="000000"/>
               <w:left w:val="single" w:sz="8" w:space="0" w:color="000000"/>
@@ -7575,18 +7731,18 @@
         </w:tc>
         <w:tc>
           <w:tcPr>
-            <w:tcW w:w="3913" w:type="dxa"/>
-            <w:tcBorders>
-              <w:top w:val="single" w:sz="8" w:space="0" w:color="000000"/>
-              <w:left w:val="single" w:sz="8" w:space="0" w:color="000000"/>
-              <w:bottom w:val="single" w:sz="8" w:space="0" w:color="000000"/>
-              <w:right w:val="single" w:sz="8" w:space="0" w:color="000000"/>
-            </w:tcBorders>
-            <w:vAlign w:val="center"/>
-          </w:tcPr>
-          <w:p>
-            <w:pPr>
-              <w:jc w:val="both"/>
+            <w:tcW w:w="2835" w:type="dxa"/>
+            <w:tcBorders>
+              <w:top w:val="single" w:sz="8" w:space="0" w:color="000000"/>
+              <w:left w:val="single" w:sz="8" w:space="0" w:color="000000"/>
+              <w:bottom w:val="single" w:sz="8" w:space="0" w:color="000000"/>
+              <w:right w:val="single" w:sz="8" w:space="0" w:color="000000"/>
+            </w:tcBorders>
+            <w:vAlign w:val="center"/>
+          </w:tcPr>
+          <w:p>
+            <w:pPr>
+              <w:jc w:val="left"/>
               <w:rPr>
                 <w:sz w:val="24"/>
                 <w:szCs w:val="24"/>
@@ -7605,11 +7761,12 @@
       </w:tr>
       <w:tr>
         <w:trPr>
+          <w:cantSplit/>
           <w:jc w:val="center"/>
         </w:trPr>
         <w:tc>
           <w:tcPr>
-            <w:tcW w:w="3367" w:type="dxa"/>
+            <w:tcW w:w="4309" w:type="dxa"/>
             <w:tcBorders>
               <w:top w:val="single" w:sz="8" w:space="0" w:color="000000"/>
               <w:left w:val="single" w:sz="8" w:space="0" w:color="000000"/>
@@ -7637,7 +7794,7 @@
         </w:tc>
         <w:tc>
           <w:tcPr>
-            <w:tcW w:w="2248" w:type="dxa"/>
+            <w:tcW w:w="1927" w:type="dxa"/>
             <w:tcBorders>
               <w:top w:val="single" w:sz="8" w:space="0" w:color="000000"/>
               <w:left w:val="single" w:sz="8" w:space="0" w:color="000000"/>
@@ -7665,18 +7822,18 @@
         </w:tc>
         <w:tc>
           <w:tcPr>
-            <w:tcW w:w="3913" w:type="dxa"/>
-            <w:tcBorders>
-              <w:top w:val="single" w:sz="8" w:space="0" w:color="000000"/>
-              <w:left w:val="single" w:sz="8" w:space="0" w:color="000000"/>
-              <w:bottom w:val="single" w:sz="8" w:space="0" w:color="000000"/>
-              <w:right w:val="single" w:sz="8" w:space="0" w:color="000000"/>
-            </w:tcBorders>
-            <w:vAlign w:val="center"/>
-          </w:tcPr>
-          <w:p>
-            <w:pPr>
-              <w:jc w:val="both"/>
+            <w:tcW w:w="2835" w:type="dxa"/>
+            <w:tcBorders>
+              <w:top w:val="single" w:sz="8" w:space="0" w:color="000000"/>
+              <w:left w:val="single" w:sz="8" w:space="0" w:color="000000"/>
+              <w:bottom w:val="single" w:sz="8" w:space="0" w:color="000000"/>
+              <w:right w:val="single" w:sz="8" w:space="0" w:color="000000"/>
+            </w:tcBorders>
+            <w:vAlign w:val="center"/>
+          </w:tcPr>
+          <w:p>
+            <w:pPr>
+              <w:jc w:val="left"/>
               <w:rPr>
                 <w:sz w:val="24"/>
                 <w:szCs w:val="24"/>
@@ -7733,6 +7890,7 @@
     </w:p>
     <w:p>
       <w:pPr>
+        <w:keepNext/>
         <w:pBdr>
           <w:top w:val="nil"/>
           <w:left w:val="nil"/>
@@ -7752,7 +7910,7 @@
           <w:sz w:val="24"/>
           <w:szCs w:val="24"/>
         </w:rPr>
-        <w:t xml:space="preserve">Pengajuan cuti melahirkan dan cuti pendampingan istri mengikuti 6.1. Langkah berikut hanya untuk hal khusus pada jenis cuti ini.</w:t>
+        <w:t xml:space="preserve">Cuti melahirkan dan cuti pendampingan istri diajukan sesuai alur 6.1. Langkah berikut hanya untuk hal khusus pada jenis cuti ini.</w:t>
       </w:r>
     </w:p>
     <w:tbl>
@@ -7765,27 +7923,30 @@
         <w:tblLook w:val="0400" w:firstRow="0" w:lastRow="0" w:firstColumn="0" w:lastColumn="0" w:noHBand="0" w:noVBand="1"/>
       </w:tblPr>
       <w:tblGrid>
-        <w:gridCol w:w="3367"/>
-        <w:gridCol w:w="2248"/>
-        <w:gridCol w:w="3913"/>
+        <w:gridCol w:w="4309"/>
+        <w:gridCol w:w="1927"/>
+        <w:gridCol w:w="2835"/>
       </w:tblGrid>
       <w:tr>
         <w:trPr>
+          <w:cantSplit/>
+          <w:tblHeader/>
           <w:jc w:val="center"/>
         </w:trPr>
         <w:tc>
           <w:tcPr>
-            <w:tcW w:w="3367" w:type="dxa"/>
-            <w:tcBorders>
-              <w:top w:val="single" w:sz="8" w:space="0" w:color="000000"/>
-              <w:left w:val="single" w:sz="8" w:space="0" w:color="000000"/>
-              <w:bottom w:val="single" w:sz="8" w:space="0" w:color="000000"/>
-              <w:right w:val="single" w:sz="8" w:space="0" w:color="000000"/>
-            </w:tcBorders>
-            <w:vAlign w:val="center"/>
-          </w:tcPr>
-          <w:p>
-            <w:pPr>
+            <w:tcW w:w="4309" w:type="dxa"/>
+            <w:tcBorders>
+              <w:top w:val="single" w:sz="8" w:space="0" w:color="000000"/>
+              <w:left w:val="single" w:sz="8" w:space="0" w:color="000000"/>
+              <w:bottom w:val="single" w:sz="8" w:space="0" w:color="000000"/>
+              <w:right w:val="single" w:sz="8" w:space="0" w:color="000000"/>
+            </w:tcBorders>
+            <w:vAlign w:val="center"/>
+          </w:tcPr>
+          <w:p>
+            <w:pPr>
+              <w:keepNext/>
               <w:jc w:val="center"/>
               <w:rPr>
                 <w:sz w:val="24"/>
@@ -7805,17 +7966,18 @@
         </w:tc>
         <w:tc>
           <w:tcPr>
-            <w:tcW w:w="2248" w:type="dxa"/>
-            <w:tcBorders>
-              <w:top w:val="single" w:sz="8" w:space="0" w:color="000000"/>
-              <w:left w:val="single" w:sz="8" w:space="0" w:color="000000"/>
-              <w:bottom w:val="single" w:sz="8" w:space="0" w:color="000000"/>
-              <w:right w:val="single" w:sz="8" w:space="0" w:color="000000"/>
-            </w:tcBorders>
-            <w:vAlign w:val="center"/>
-          </w:tcPr>
-          <w:p>
-            <w:pPr>
+            <w:tcW w:w="1927" w:type="dxa"/>
+            <w:tcBorders>
+              <w:top w:val="single" w:sz="8" w:space="0" w:color="000000"/>
+              <w:left w:val="single" w:sz="8" w:space="0" w:color="000000"/>
+              <w:bottom w:val="single" w:sz="8" w:space="0" w:color="000000"/>
+              <w:right w:val="single" w:sz="8" w:space="0" w:color="000000"/>
+            </w:tcBorders>
+            <w:vAlign w:val="center"/>
+          </w:tcPr>
+          <w:p>
+            <w:pPr>
+              <w:keepNext/>
               <w:jc w:val="center"/>
               <w:rPr>
                 <w:sz w:val="24"/>
@@ -7835,17 +7997,18 @@
         </w:tc>
         <w:tc>
           <w:tcPr>
-            <w:tcW w:w="3913" w:type="dxa"/>
-            <w:tcBorders>
-              <w:top w:val="single" w:sz="8" w:space="0" w:color="000000"/>
-              <w:left w:val="single" w:sz="8" w:space="0" w:color="000000"/>
-              <w:bottom w:val="single" w:sz="8" w:space="0" w:color="000000"/>
-              <w:right w:val="single" w:sz="8" w:space="0" w:color="000000"/>
-            </w:tcBorders>
-            <w:vAlign w:val="center"/>
-          </w:tcPr>
-          <w:p>
-            <w:pPr>
+            <w:tcW w:w="2835" w:type="dxa"/>
+            <w:tcBorders>
+              <w:top w:val="single" w:sz="8" w:space="0" w:color="000000"/>
+              <w:left w:val="single" w:sz="8" w:space="0" w:color="000000"/>
+              <w:bottom w:val="single" w:sz="8" w:space="0" w:color="000000"/>
+              <w:right w:val="single" w:sz="8" w:space="0" w:color="000000"/>
+            </w:tcBorders>
+            <w:vAlign w:val="center"/>
+          </w:tcPr>
+          <w:p>
+            <w:pPr>
+              <w:keepNext/>
               <w:jc w:val="center"/>
               <w:rPr>
                 <w:sz w:val="24"/>
@@ -7866,39 +8029,40 @@
       </w:tr>
       <w:tr>
         <w:trPr>
+          <w:cantSplit/>
           <w:jc w:val="center"/>
         </w:trPr>
         <w:tc>
           <w:tcPr>
-            <w:tcW w:w="3367" w:type="dxa"/>
-            <w:tcBorders>
-              <w:top w:val="single" w:sz="8" w:space="0" w:color="000000"/>
-              <w:left w:val="single" w:sz="8" w:space="0" w:color="000000"/>
-              <w:bottom w:val="single" w:sz="8" w:space="0" w:color="000000"/>
-              <w:right w:val="single" w:sz="8" w:space="0" w:color="000000"/>
-            </w:tcBorders>
-            <w:vAlign w:val="center"/>
-          </w:tcPr>
-          <w:p>
-            <w:pPr>
-              <w:rPr>
-                <w:sz w:val="24"/>
-                <w:szCs w:val="24"/>
-              </w:rPr>
-            </w:pPr>
-            <w:r>
-              <w:rPr>
-                <w:b w:val="0"/>
-                <w:sz w:val="24"/>
-                <w:szCs w:val="24"/>
-              </w:rPr>
-              <w:t>1. Beri tahu atasan langsung dan HRGA Officer bila menunda jadwal cuti melahirkan, disertai surat keterangan dokter (butir 4.19).</w:t>
-            </w:r>
-          </w:p>
-        </w:tc>
-        <w:tc>
-          <w:tcPr>
-            <w:tcW w:w="2248" w:type="dxa"/>
+            <w:tcW w:w="4309" w:type="dxa"/>
+            <w:tcBorders>
+              <w:top w:val="single" w:sz="8" w:space="0" w:color="000000"/>
+              <w:left w:val="single" w:sz="8" w:space="0" w:color="000000"/>
+              <w:bottom w:val="single" w:sz="8" w:space="0" w:color="000000"/>
+              <w:right w:val="single" w:sz="8" w:space="0" w:color="000000"/>
+            </w:tcBorders>
+            <w:vAlign w:val="center"/>
+          </w:tcPr>
+          <w:p>
+            <w:pPr>
+              <w:rPr>
+                <w:sz w:val="24"/>
+                <w:szCs w:val="24"/>
+              </w:rPr>
+            </w:pPr>
+            <w:r>
+              <w:rPr>
+                <w:b w:val="0"/>
+                <w:sz w:val="24"/>
+                <w:szCs w:val="24"/>
+              </w:rPr>
+              <w:t>1. Beri tahu atasan langsung dan HRGA Officer jika menunda jadwal cuti melahirkan, disertai surat keterangan dokter (butir 4.19).</w:t>
+            </w:r>
+          </w:p>
+        </w:tc>
+        <w:tc>
+          <w:tcPr>
+            <w:tcW w:w="1927" w:type="dxa"/>
             <w:tcBorders>
               <w:top w:val="single" w:sz="8" w:space="0" w:color="000000"/>
               <w:left w:val="single" w:sz="8" w:space="0" w:color="000000"/>
@@ -7926,18 +8090,18 @@
         </w:tc>
         <w:tc>
           <w:tcPr>
-            <w:tcW w:w="3913" w:type="dxa"/>
-            <w:tcBorders>
-              <w:top w:val="single" w:sz="8" w:space="0" w:color="000000"/>
-              <w:left w:val="single" w:sz="8" w:space="0" w:color="000000"/>
-              <w:bottom w:val="single" w:sz="8" w:space="0" w:color="000000"/>
-              <w:right w:val="single" w:sz="8" w:space="0" w:color="000000"/>
-            </w:tcBorders>
-            <w:vAlign w:val="center"/>
-          </w:tcPr>
-          <w:p>
-            <w:pPr>
-              <w:jc w:val="both"/>
+            <w:tcW w:w="2835" w:type="dxa"/>
+            <w:tcBorders>
+              <w:top w:val="single" w:sz="8" w:space="0" w:color="000000"/>
+              <w:left w:val="single" w:sz="8" w:space="0" w:color="000000"/>
+              <w:bottom w:val="single" w:sz="8" w:space="0" w:color="000000"/>
+              <w:right w:val="single" w:sz="8" w:space="0" w:color="000000"/>
+            </w:tcBorders>
+            <w:vAlign w:val="center"/>
+          </w:tcPr>
+          <w:p>
+            <w:pPr>
+              <w:jc w:val="left"/>
               <w:rPr>
                 <w:sz w:val="24"/>
                 <w:szCs w:val="24"/>
@@ -7956,11 +8120,12 @@
       </w:tr>
       <w:tr>
         <w:trPr>
+          <w:cantSplit/>
           <w:jc w:val="center"/>
         </w:trPr>
         <w:tc>
           <w:tcPr>
-            <w:tcW w:w="3367" w:type="dxa"/>
+            <w:tcW w:w="4309" w:type="dxa"/>
             <w:tcBorders>
               <w:top w:val="single" w:sz="8" w:space="0" w:color="000000"/>
               <w:left w:val="single" w:sz="8" w:space="0" w:color="000000"/>
@@ -7988,7 +8153,7 @@
         </w:tc>
         <w:tc>
           <w:tcPr>
-            <w:tcW w:w="2248" w:type="dxa"/>
+            <w:tcW w:w="1927" w:type="dxa"/>
             <w:tcBorders>
               <w:top w:val="single" w:sz="8" w:space="0" w:color="000000"/>
               <w:left w:val="single" w:sz="8" w:space="0" w:color="000000"/>
@@ -8016,18 +8181,18 @@
         </w:tc>
         <w:tc>
           <w:tcPr>
-            <w:tcW w:w="3913" w:type="dxa"/>
-            <w:tcBorders>
-              <w:top w:val="single" w:sz="8" w:space="0" w:color="000000"/>
-              <w:left w:val="single" w:sz="8" w:space="0" w:color="000000"/>
-              <w:bottom w:val="single" w:sz="8" w:space="0" w:color="000000"/>
-              <w:right w:val="single" w:sz="8" w:space="0" w:color="000000"/>
-            </w:tcBorders>
-            <w:vAlign w:val="center"/>
-          </w:tcPr>
-          <w:p>
-            <w:pPr>
-              <w:jc w:val="both"/>
+            <w:tcW w:w="2835" w:type="dxa"/>
+            <w:tcBorders>
+              <w:top w:val="single" w:sz="8" w:space="0" w:color="000000"/>
+              <w:left w:val="single" w:sz="8" w:space="0" w:color="000000"/>
+              <w:bottom w:val="single" w:sz="8" w:space="0" w:color="000000"/>
+              <w:right w:val="single" w:sz="8" w:space="0" w:color="000000"/>
+            </w:tcBorders>
+            <w:vAlign w:val="center"/>
+          </w:tcPr>
+          <w:p>
+            <w:pPr>
+              <w:jc w:val="left"/>
               <w:rPr>
                 <w:sz w:val="24"/>
                 <w:szCs w:val="24"/>
@@ -8046,11 +8211,12 @@
       </w:tr>
       <w:tr>
         <w:trPr>
+          <w:cantSplit/>
           <w:jc w:val="center"/>
         </w:trPr>
         <w:tc>
           <w:tcPr>
-            <w:tcW w:w="3367" w:type="dxa"/>
+            <w:tcW w:w="4309" w:type="dxa"/>
             <w:tcBorders>
               <w:top w:val="single" w:sz="8" w:space="0" w:color="000000"/>
               <w:left w:val="single" w:sz="8" w:space="0" w:color="000000"/>
@@ -8078,7 +8244,7 @@
         </w:tc>
         <w:tc>
           <w:tcPr>
-            <w:tcW w:w="2248" w:type="dxa"/>
+            <w:tcW w:w="1927" w:type="dxa"/>
             <w:tcBorders>
               <w:top w:val="single" w:sz="8" w:space="0" w:color="000000"/>
               <w:left w:val="single" w:sz="8" w:space="0" w:color="000000"/>
@@ -8106,18 +8272,18 @@
         </w:tc>
         <w:tc>
           <w:tcPr>
-            <w:tcW w:w="3913" w:type="dxa"/>
-            <w:tcBorders>
-              <w:top w:val="single" w:sz="8" w:space="0" w:color="000000"/>
-              <w:left w:val="single" w:sz="8" w:space="0" w:color="000000"/>
-              <w:bottom w:val="single" w:sz="8" w:space="0" w:color="000000"/>
-              <w:right w:val="single" w:sz="8" w:space="0" w:color="000000"/>
-            </w:tcBorders>
-            <w:vAlign w:val="center"/>
-          </w:tcPr>
-          <w:p>
-            <w:pPr>
-              <w:jc w:val="both"/>
+            <w:tcW w:w="2835" w:type="dxa"/>
+            <w:tcBorders>
+              <w:top w:val="single" w:sz="8" w:space="0" w:color="000000"/>
+              <w:left w:val="single" w:sz="8" w:space="0" w:color="000000"/>
+              <w:bottom w:val="single" w:sz="8" w:space="0" w:color="000000"/>
+              <w:right w:val="single" w:sz="8" w:space="0" w:color="000000"/>
+            </w:tcBorders>
+            <w:vAlign w:val="center"/>
+          </w:tcPr>
+          <w:p>
+            <w:pPr>
+              <w:jc w:val="left"/>
               <w:rPr>
                 <w:sz w:val="24"/>
                 <w:szCs w:val="24"/>
@@ -8136,11 +8302,12 @@
       </w:tr>
       <w:tr>
         <w:trPr>
+          <w:cantSplit/>
           <w:jc w:val="center"/>
         </w:trPr>
         <w:tc>
           <w:tcPr>
-            <w:tcW w:w="3367" w:type="dxa"/>
+            <w:tcW w:w="4309" w:type="dxa"/>
             <w:tcBorders>
               <w:top w:val="single" w:sz="8" w:space="0" w:color="000000"/>
               <w:left w:val="single" w:sz="8" w:space="0" w:color="000000"/>
@@ -8168,7 +8335,7 @@
         </w:tc>
         <w:tc>
           <w:tcPr>
-            <w:tcW w:w="2248" w:type="dxa"/>
+            <w:tcW w:w="1927" w:type="dxa"/>
             <w:tcBorders>
               <w:top w:val="single" w:sz="8" w:space="0" w:color="000000"/>
               <w:left w:val="single" w:sz="8" w:space="0" w:color="000000"/>
@@ -8196,18 +8363,18 @@
         </w:tc>
         <w:tc>
           <w:tcPr>
-            <w:tcW w:w="3913" w:type="dxa"/>
-            <w:tcBorders>
-              <w:top w:val="single" w:sz="8" w:space="0" w:color="000000"/>
-              <w:left w:val="single" w:sz="8" w:space="0" w:color="000000"/>
-              <w:bottom w:val="single" w:sz="8" w:space="0" w:color="000000"/>
-              <w:right w:val="single" w:sz="8" w:space="0" w:color="000000"/>
-            </w:tcBorders>
-            <w:vAlign w:val="center"/>
-          </w:tcPr>
-          <w:p>
-            <w:pPr>
-              <w:jc w:val="both"/>
+            <w:tcW w:w="2835" w:type="dxa"/>
+            <w:tcBorders>
+              <w:top w:val="single" w:sz="8" w:space="0" w:color="000000"/>
+              <w:left w:val="single" w:sz="8" w:space="0" w:color="000000"/>
+              <w:bottom w:val="single" w:sz="8" w:space="0" w:color="000000"/>
+              <w:right w:val="single" w:sz="8" w:space="0" w:color="000000"/>
+            </w:tcBorders>
+            <w:vAlign w:val="center"/>
+          </w:tcPr>
+          <w:p>
+            <w:pPr>
+              <w:jc w:val="left"/>
               <w:rPr>
                 <w:sz w:val="24"/>
                 <w:szCs w:val="24"/>
@@ -8252,6 +8419,7 @@
     <w:p>
       <w:pPr>
         <w:pStyle w:val="Heading2"/>
+        <w:keepNext/>
         <w:numPr>
           <w:ilvl w:val="1"/>
           <w:numId w:val="7"/>
@@ -8272,27 +8440,30 @@
         <w:tblLook w:val="0400" w:firstRow="0" w:lastRow="0" w:firstColumn="0" w:lastColumn="0" w:noHBand="0" w:noVBand="1"/>
       </w:tblPr>
       <w:tblGrid>
-        <w:gridCol w:w="3367"/>
-        <w:gridCol w:w="2248"/>
-        <w:gridCol w:w="3913"/>
+        <w:gridCol w:w="4309"/>
+        <w:gridCol w:w="1927"/>
+        <w:gridCol w:w="2835"/>
       </w:tblGrid>
       <w:tr>
         <w:trPr>
+          <w:cantSplit/>
+          <w:tblHeader/>
           <w:jc w:val="center"/>
         </w:trPr>
         <w:tc>
           <w:tcPr>
-            <w:tcW w:w="3367" w:type="dxa"/>
-            <w:tcBorders>
-              <w:top w:val="single" w:sz="8" w:space="0" w:color="000000"/>
-              <w:left w:val="single" w:sz="8" w:space="0" w:color="000000"/>
-              <w:bottom w:val="single" w:sz="8" w:space="0" w:color="000000"/>
-              <w:right w:val="single" w:sz="8" w:space="0" w:color="000000"/>
-            </w:tcBorders>
-            <w:vAlign w:val="center"/>
-          </w:tcPr>
-          <w:p>
-            <w:pPr>
+            <w:tcW w:w="4309" w:type="dxa"/>
+            <w:tcBorders>
+              <w:top w:val="single" w:sz="8" w:space="0" w:color="000000"/>
+              <w:left w:val="single" w:sz="8" w:space="0" w:color="000000"/>
+              <w:bottom w:val="single" w:sz="8" w:space="0" w:color="000000"/>
+              <w:right w:val="single" w:sz="8" w:space="0" w:color="000000"/>
+            </w:tcBorders>
+            <w:vAlign w:val="center"/>
+          </w:tcPr>
+          <w:p>
+            <w:pPr>
+              <w:keepNext/>
               <w:jc w:val="center"/>
               <w:rPr>
                 <w:sz w:val="24"/>
@@ -8312,17 +8483,18 @@
         </w:tc>
         <w:tc>
           <w:tcPr>
-            <w:tcW w:w="2248" w:type="dxa"/>
-            <w:tcBorders>
-              <w:top w:val="single" w:sz="8" w:space="0" w:color="000000"/>
-              <w:left w:val="single" w:sz="8" w:space="0" w:color="000000"/>
-              <w:bottom w:val="single" w:sz="8" w:space="0" w:color="000000"/>
-              <w:right w:val="single" w:sz="8" w:space="0" w:color="000000"/>
-            </w:tcBorders>
-            <w:vAlign w:val="center"/>
-          </w:tcPr>
-          <w:p>
-            <w:pPr>
+            <w:tcW w:w="1927" w:type="dxa"/>
+            <w:tcBorders>
+              <w:top w:val="single" w:sz="8" w:space="0" w:color="000000"/>
+              <w:left w:val="single" w:sz="8" w:space="0" w:color="000000"/>
+              <w:bottom w:val="single" w:sz="8" w:space="0" w:color="000000"/>
+              <w:right w:val="single" w:sz="8" w:space="0" w:color="000000"/>
+            </w:tcBorders>
+            <w:vAlign w:val="center"/>
+          </w:tcPr>
+          <w:p>
+            <w:pPr>
+              <w:keepNext/>
               <w:jc w:val="center"/>
               <w:rPr>
                 <w:sz w:val="24"/>
@@ -8342,17 +8514,18 @@
         </w:tc>
         <w:tc>
           <w:tcPr>
-            <w:tcW w:w="3913" w:type="dxa"/>
-            <w:tcBorders>
-              <w:top w:val="single" w:sz="8" w:space="0" w:color="000000"/>
-              <w:left w:val="single" w:sz="8" w:space="0" w:color="000000"/>
-              <w:bottom w:val="single" w:sz="8" w:space="0" w:color="000000"/>
-              <w:right w:val="single" w:sz="8" w:space="0" w:color="000000"/>
-            </w:tcBorders>
-            <w:vAlign w:val="center"/>
-          </w:tcPr>
-          <w:p>
-            <w:pPr>
+            <w:tcW w:w="2835" w:type="dxa"/>
+            <w:tcBorders>
+              <w:top w:val="single" w:sz="8" w:space="0" w:color="000000"/>
+              <w:left w:val="single" w:sz="8" w:space="0" w:color="000000"/>
+              <w:bottom w:val="single" w:sz="8" w:space="0" w:color="000000"/>
+              <w:right w:val="single" w:sz="8" w:space="0" w:color="000000"/>
+            </w:tcBorders>
+            <w:vAlign w:val="center"/>
+          </w:tcPr>
+          <w:p>
+            <w:pPr>
+              <w:keepNext/>
               <w:jc w:val="center"/>
               <w:rPr>
                 <w:sz w:val="24"/>
@@ -8373,39 +8546,40 @@
       </w:tr>
       <w:tr>
         <w:trPr>
+          <w:cantSplit/>
           <w:jc w:val="center"/>
         </w:trPr>
         <w:tc>
           <w:tcPr>
-            <w:tcW w:w="3367" w:type="dxa"/>
-            <w:tcBorders>
-              <w:top w:val="single" w:sz="8" w:space="0" w:color="000000"/>
-              <w:left w:val="single" w:sz="8" w:space="0" w:color="000000"/>
-              <w:bottom w:val="single" w:sz="8" w:space="0" w:color="000000"/>
-              <w:right w:val="single" w:sz="8" w:space="0" w:color="000000"/>
-            </w:tcBorders>
-            <w:vAlign w:val="center"/>
-          </w:tcPr>
-          <w:p>
-            <w:pPr>
-              <w:rPr>
-                <w:sz w:val="24"/>
-                <w:szCs w:val="24"/>
-              </w:rPr>
-            </w:pPr>
-            <w:r>
-              <w:rPr>
-                <w:b w:val="0"/>
-                <w:sz w:val="24"/>
-                <w:szCs w:val="24"/>
-              </w:rPr>
-              <w:t>1. Tunda waktu cuti karyawan bila kepentingan Perusahaan menghendaki (butir 4.10).</w:t>
-            </w:r>
-          </w:p>
-        </w:tc>
-        <w:tc>
-          <w:tcPr>
-            <w:tcW w:w="2248" w:type="dxa"/>
+            <w:tcW w:w="4309" w:type="dxa"/>
+            <w:tcBorders>
+              <w:top w:val="single" w:sz="8" w:space="0" w:color="000000"/>
+              <w:left w:val="single" w:sz="8" w:space="0" w:color="000000"/>
+              <w:bottom w:val="single" w:sz="8" w:space="0" w:color="000000"/>
+              <w:right w:val="single" w:sz="8" w:space="0" w:color="000000"/>
+            </w:tcBorders>
+            <w:vAlign w:val="center"/>
+          </w:tcPr>
+          <w:p>
+            <w:pPr>
+              <w:rPr>
+                <w:sz w:val="24"/>
+                <w:szCs w:val="24"/>
+              </w:rPr>
+            </w:pPr>
+            <w:r>
+              <w:rPr>
+                <w:b w:val="0"/>
+                <w:sz w:val="24"/>
+                <w:szCs w:val="24"/>
+              </w:rPr>
+              <w:t>1. Tunda waktu cuti karyawan jika kepentingan Perusahaan menghendaki (butir 4.10).</w:t>
+            </w:r>
+          </w:p>
+        </w:tc>
+        <w:tc>
+          <w:tcPr>
+            <w:tcW w:w="1927" w:type="dxa"/>
             <w:tcBorders>
               <w:top w:val="single" w:sz="8" w:space="0" w:color="000000"/>
               <w:left w:val="single" w:sz="8" w:space="0" w:color="000000"/>
@@ -8433,18 +8607,18 @@
         </w:tc>
         <w:tc>
           <w:tcPr>
-            <w:tcW w:w="3913" w:type="dxa"/>
-            <w:tcBorders>
-              <w:top w:val="single" w:sz="8" w:space="0" w:color="000000"/>
-              <w:left w:val="single" w:sz="8" w:space="0" w:color="000000"/>
-              <w:bottom w:val="single" w:sz="8" w:space="0" w:color="000000"/>
-              <w:right w:val="single" w:sz="8" w:space="0" w:color="000000"/>
-            </w:tcBorders>
-            <w:vAlign w:val="center"/>
-          </w:tcPr>
-          <w:p>
-            <w:pPr>
-              <w:jc w:val="both"/>
+            <w:tcW w:w="2835" w:type="dxa"/>
+            <w:tcBorders>
+              <w:top w:val="single" w:sz="8" w:space="0" w:color="000000"/>
+              <w:left w:val="single" w:sz="8" w:space="0" w:color="000000"/>
+              <w:bottom w:val="single" w:sz="8" w:space="0" w:color="000000"/>
+              <w:right w:val="single" w:sz="8" w:space="0" w:color="000000"/>
+            </w:tcBorders>
+            <w:vAlign w:val="center"/>
+          </w:tcPr>
+          <w:p>
+            <w:pPr>
+              <w:jc w:val="left"/>
               <w:rPr>
                 <w:sz w:val="24"/>
                 <w:szCs w:val="24"/>
@@ -8463,11 +8637,12 @@
       </w:tr>
       <w:tr>
         <w:trPr>
+          <w:cantSplit/>
           <w:jc w:val="center"/>
         </w:trPr>
         <w:tc>
           <w:tcPr>
-            <w:tcW w:w="3367" w:type="dxa"/>
+            <w:tcW w:w="4309" w:type="dxa"/>
             <w:tcBorders>
               <w:top w:val="single" w:sz="8" w:space="0" w:color="000000"/>
               <w:left w:val="single" w:sz="8" w:space="0" w:color="000000"/>
@@ -8495,7 +8670,7 @@
         </w:tc>
         <w:tc>
           <w:tcPr>
-            <w:tcW w:w="2248" w:type="dxa"/>
+            <w:tcW w:w="1927" w:type="dxa"/>
             <w:tcBorders>
               <w:top w:val="single" w:sz="8" w:space="0" w:color="000000"/>
               <w:left w:val="single" w:sz="8" w:space="0" w:color="000000"/>
@@ -8523,18 +8698,18 @@
         </w:tc>
         <w:tc>
           <w:tcPr>
-            <w:tcW w:w="3913" w:type="dxa"/>
-            <w:tcBorders>
-              <w:top w:val="single" w:sz="8" w:space="0" w:color="000000"/>
-              <w:left w:val="single" w:sz="8" w:space="0" w:color="000000"/>
-              <w:bottom w:val="single" w:sz="8" w:space="0" w:color="000000"/>
-              <w:right w:val="single" w:sz="8" w:space="0" w:color="000000"/>
-            </w:tcBorders>
-            <w:vAlign w:val="center"/>
-          </w:tcPr>
-          <w:p>
-            <w:pPr>
-              <w:jc w:val="both"/>
+            <w:tcW w:w="2835" w:type="dxa"/>
+            <w:tcBorders>
+              <w:top w:val="single" w:sz="8" w:space="0" w:color="000000"/>
+              <w:left w:val="single" w:sz="8" w:space="0" w:color="000000"/>
+              <w:bottom w:val="single" w:sz="8" w:space="0" w:color="000000"/>
+              <w:right w:val="single" w:sz="8" w:space="0" w:color="000000"/>
+            </w:tcBorders>
+            <w:vAlign w:val="center"/>
+          </w:tcPr>
+          <w:p>
+            <w:pPr>
+              <w:jc w:val="left"/>
               <w:rPr>
                 <w:sz w:val="24"/>
                 <w:szCs w:val="24"/>
@@ -8553,39 +8728,40 @@
       </w:tr>
       <w:tr>
         <w:trPr>
+          <w:cantSplit/>
           <w:jc w:val="center"/>
         </w:trPr>
         <w:tc>
           <w:tcPr>
-            <w:tcW w:w="3367" w:type="dxa"/>
-            <w:tcBorders>
-              <w:top w:val="single" w:sz="8" w:space="0" w:color="000000"/>
-              <w:left w:val="single" w:sz="8" w:space="0" w:color="000000"/>
-              <w:bottom w:val="single" w:sz="8" w:space="0" w:color="000000"/>
-              <w:right w:val="single" w:sz="8" w:space="0" w:color="000000"/>
-            </w:tcBorders>
-            <w:vAlign w:val="center"/>
-          </w:tcPr>
-          <w:p>
-            <w:pPr>
-              <w:rPr>
-                <w:sz w:val="24"/>
-                <w:szCs w:val="24"/>
-              </w:rPr>
-            </w:pPr>
-            <w:r>
-              <w:rPr>
-                <w:b w:val="0"/>
-                <w:sz w:val="24"/>
-                <w:szCs w:val="24"/>
-              </w:rPr>
-              <w:t>3. Panggil kembali karyawan yang sedang cuti bila kondisi butir 4.11 terpenuhi (USULAN).</w:t>
-            </w:r>
-          </w:p>
-        </w:tc>
-        <w:tc>
-          <w:tcPr>
-            <w:tcW w:w="2248" w:type="dxa"/>
+            <w:tcW w:w="4309" w:type="dxa"/>
+            <w:tcBorders>
+              <w:top w:val="single" w:sz="8" w:space="0" w:color="000000"/>
+              <w:left w:val="single" w:sz="8" w:space="0" w:color="000000"/>
+              <w:bottom w:val="single" w:sz="8" w:space="0" w:color="000000"/>
+              <w:right w:val="single" w:sz="8" w:space="0" w:color="000000"/>
+            </w:tcBorders>
+            <w:vAlign w:val="center"/>
+          </w:tcPr>
+          <w:p>
+            <w:pPr>
+              <w:rPr>
+                <w:sz w:val="24"/>
+                <w:szCs w:val="24"/>
+              </w:rPr>
+            </w:pPr>
+            <w:r>
+              <w:rPr>
+                <w:b w:val="0"/>
+                <w:sz w:val="24"/>
+                <w:szCs w:val="24"/>
+              </w:rPr>
+              <w:t>3. Panggil kembali karyawan yang sedang cuti jika kondisi butir 4.11 terpenuhi (USULAN).</w:t>
+            </w:r>
+          </w:p>
+        </w:tc>
+        <w:tc>
+          <w:tcPr>
+            <w:tcW w:w="1927" w:type="dxa"/>
             <w:tcBorders>
               <w:top w:val="single" w:sz="8" w:space="0" w:color="000000"/>
               <w:left w:val="single" w:sz="8" w:space="0" w:color="000000"/>
@@ -8613,18 +8789,18 @@
         </w:tc>
         <w:tc>
           <w:tcPr>
-            <w:tcW w:w="3913" w:type="dxa"/>
-            <w:tcBorders>
-              <w:top w:val="single" w:sz="8" w:space="0" w:color="000000"/>
-              <w:left w:val="single" w:sz="8" w:space="0" w:color="000000"/>
-              <w:bottom w:val="single" w:sz="8" w:space="0" w:color="000000"/>
-              <w:right w:val="single" w:sz="8" w:space="0" w:color="000000"/>
-            </w:tcBorders>
-            <w:vAlign w:val="center"/>
-          </w:tcPr>
-          <w:p>
-            <w:pPr>
-              <w:jc w:val="both"/>
+            <w:tcW w:w="2835" w:type="dxa"/>
+            <w:tcBorders>
+              <w:top w:val="single" w:sz="8" w:space="0" w:color="000000"/>
+              <w:left w:val="single" w:sz="8" w:space="0" w:color="000000"/>
+              <w:bottom w:val="single" w:sz="8" w:space="0" w:color="000000"/>
+              <w:right w:val="single" w:sz="8" w:space="0" w:color="000000"/>
+            </w:tcBorders>
+            <w:vAlign w:val="center"/>
+          </w:tcPr>
+          <w:p>
+            <w:pPr>
+              <w:jc w:val="left"/>
               <w:rPr>
                 <w:sz w:val="24"/>
                 <w:szCs w:val="24"/>
@@ -8643,11 +8819,12 @@
       </w:tr>
       <w:tr>
         <w:trPr>
+          <w:cantSplit/>
           <w:jc w:val="center"/>
         </w:trPr>
         <w:tc>
           <w:tcPr>
-            <w:tcW w:w="3367" w:type="dxa"/>
+            <w:tcW w:w="4309" w:type="dxa"/>
             <w:tcBorders>
               <w:top w:val="single" w:sz="8" w:space="0" w:color="000000"/>
               <w:left w:val="single" w:sz="8" w:space="0" w:color="000000"/>
@@ -8675,7 +8852,7 @@
         </w:tc>
         <w:tc>
           <w:tcPr>
-            <w:tcW w:w="2248" w:type="dxa"/>
+            <w:tcW w:w="1927" w:type="dxa"/>
             <w:tcBorders>
               <w:top w:val="single" w:sz="8" w:space="0" w:color="000000"/>
               <w:left w:val="single" w:sz="8" w:space="0" w:color="000000"/>
@@ -8703,18 +8880,18 @@
         </w:tc>
         <w:tc>
           <w:tcPr>
-            <w:tcW w:w="3913" w:type="dxa"/>
-            <w:tcBorders>
-              <w:top w:val="single" w:sz="8" w:space="0" w:color="000000"/>
-              <w:left w:val="single" w:sz="8" w:space="0" w:color="000000"/>
-              <w:bottom w:val="single" w:sz="8" w:space="0" w:color="000000"/>
-              <w:right w:val="single" w:sz="8" w:space="0" w:color="000000"/>
-            </w:tcBorders>
-            <w:vAlign w:val="center"/>
-          </w:tcPr>
-          <w:p>
-            <w:pPr>
-              <w:jc w:val="both"/>
+            <w:tcW w:w="2835" w:type="dxa"/>
+            <w:tcBorders>
+              <w:top w:val="single" w:sz="8" w:space="0" w:color="000000"/>
+              <w:left w:val="single" w:sz="8" w:space="0" w:color="000000"/>
+              <w:bottom w:val="single" w:sz="8" w:space="0" w:color="000000"/>
+              <w:right w:val="single" w:sz="8" w:space="0" w:color="000000"/>
+            </w:tcBorders>
+            <w:vAlign w:val="center"/>
+          </w:tcPr>
+          <w:p>
+            <w:pPr>
+              <w:jc w:val="left"/>
               <w:rPr>
                 <w:sz w:val="24"/>
                 <w:szCs w:val="24"/>
@@ -8733,11 +8910,12 @@
       </w:tr>
       <w:tr>
         <w:trPr>
+          <w:cantSplit/>
           <w:jc w:val="center"/>
         </w:trPr>
         <w:tc>
           <w:tcPr>
-            <w:tcW w:w="3367" w:type="dxa"/>
+            <w:tcW w:w="4309" w:type="dxa"/>
             <w:tcBorders>
               <w:top w:val="single" w:sz="8" w:space="0" w:color="000000"/>
               <w:left w:val="single" w:sz="8" w:space="0" w:color="000000"/>
@@ -8765,7 +8943,7 @@
         </w:tc>
         <w:tc>
           <w:tcPr>
-            <w:tcW w:w="2248" w:type="dxa"/>
+            <w:tcW w:w="1927" w:type="dxa"/>
             <w:tcBorders>
               <w:top w:val="single" w:sz="8" w:space="0" w:color="000000"/>
               <w:left w:val="single" w:sz="8" w:space="0" w:color="000000"/>
@@ -8793,18 +8971,18 @@
         </w:tc>
         <w:tc>
           <w:tcPr>
-            <w:tcW w:w="3913" w:type="dxa"/>
-            <w:tcBorders>
-              <w:top w:val="single" w:sz="8" w:space="0" w:color="000000"/>
-              <w:left w:val="single" w:sz="8" w:space="0" w:color="000000"/>
-              <w:bottom w:val="single" w:sz="8" w:space="0" w:color="000000"/>
-              <w:right w:val="single" w:sz="8" w:space="0" w:color="000000"/>
-            </w:tcBorders>
-            <w:vAlign w:val="center"/>
-          </w:tcPr>
-          <w:p>
-            <w:pPr>
-              <w:jc w:val="both"/>
+            <w:tcW w:w="2835" w:type="dxa"/>
+            <w:tcBorders>
+              <w:top w:val="single" w:sz="8" w:space="0" w:color="000000"/>
+              <w:left w:val="single" w:sz="8" w:space="0" w:color="000000"/>
+              <w:bottom w:val="single" w:sz="8" w:space="0" w:color="000000"/>
+              <w:right w:val="single" w:sz="8" w:space="0" w:color="000000"/>
+            </w:tcBorders>
+            <w:vAlign w:val="center"/>
+          </w:tcPr>
+          <w:p>
+            <w:pPr>
+              <w:jc w:val="left"/>
               <w:rPr>
                 <w:sz w:val="24"/>
                 <w:szCs w:val="24"/>
@@ -8977,6 +9155,7 @@
     <w:p>
       <w:pPr>
         <w:pStyle w:val="Heading1"/>
+        <w:keepNext/>
         <w:numPr>
           <w:ilvl w:val="0"/>
           <w:numId w:val="7"/>
@@ -9005,6 +9184,8 @@
       </w:tblGrid>
       <w:tr>
         <w:trPr>
+          <w:cantSplit/>
+          <w:tblHeader/>
           <w:jc w:val="center"/>
         </w:trPr>
         <w:tc>
@@ -9020,6 +9201,7 @@
           </w:tcPr>
           <w:p>
             <w:pPr>
+              <w:keepNext/>
               <w:jc w:val="center"/>
               <w:rPr>
                 <w:sz w:val="24"/>
@@ -9050,6 +9232,7 @@
           </w:tcPr>
           <w:p>
             <w:pPr>
+              <w:keepNext/>
               <w:jc w:val="center"/>
               <w:rPr>
                 <w:sz w:val="24"/>
@@ -9080,6 +9263,7 @@
           </w:tcPr>
           <w:p>
             <w:pPr>
+              <w:keepNext/>
               <w:jc w:val="center"/>
               <w:rPr>
                 <w:sz w:val="24"/>
@@ -9100,6 +9284,7 @@
       </w:tr>
       <w:tr>
         <w:trPr>
+          <w:cantSplit/>
           <w:jc w:val="center"/>
         </w:trPr>
         <w:tc>
@@ -9171,7 +9356,7 @@
           </w:tcPr>
           <w:p>
             <w:pPr>
-              <w:jc w:val="both"/>
+              <w:jc w:val="left"/>
               <w:rPr>
                 <w:sz w:val="24"/>
                 <w:szCs w:val="24"/>
@@ -9190,6 +9375,7 @@
       </w:tr>
       <w:tr>
         <w:trPr>
+          <w:cantSplit/>
           <w:jc w:val="center"/>
         </w:trPr>
         <w:tc>
@@ -9261,7 +9447,7 @@
           </w:tcPr>
           <w:p>
             <w:pPr>
-              <w:jc w:val="both"/>
+              <w:jc w:val="left"/>
               <w:rPr>
                 <w:sz w:val="24"/>
                 <w:szCs w:val="24"/>
@@ -9280,6 +9466,7 @@
       </w:tr>
       <w:tr>
         <w:trPr>
+          <w:cantSplit/>
           <w:jc w:val="center"/>
         </w:trPr>
         <w:tc>
@@ -9351,7 +9538,7 @@
           </w:tcPr>
           <w:p>
             <w:pPr>
-              <w:jc w:val="both"/>
+              <w:jc w:val="left"/>
               <w:rPr>
                 <w:sz w:val="24"/>
                 <w:szCs w:val="24"/>
@@ -9370,6 +9557,7 @@
       </w:tr>
       <w:tr>
         <w:trPr>
+          <w:cantSplit/>
           <w:jc w:val="center"/>
         </w:trPr>
         <w:tc>
@@ -9441,7 +9629,7 @@
           </w:tcPr>
           <w:p>
             <w:pPr>
-              <w:jc w:val="both"/>
+              <w:jc w:val="left"/>
               <w:rPr>
                 <w:sz w:val="24"/>
                 <w:szCs w:val="24"/>
@@ -9460,6 +9648,7 @@
       </w:tr>
       <w:tr>
         <w:trPr>
+          <w:cantSplit/>
           <w:jc w:val="center"/>
         </w:trPr>
         <w:tc>
@@ -9531,7 +9720,7 @@
           </w:tcPr>
           <w:p>
             <w:pPr>
-              <w:jc w:val="both"/>
+              <w:jc w:val="left"/>
               <w:rPr>
                 <w:sz w:val="24"/>
                 <w:szCs w:val="24"/>
@@ -9550,6 +9739,7 @@
       </w:tr>
       <w:tr>
         <w:trPr>
+          <w:cantSplit/>
           <w:jc w:val="center"/>
         </w:trPr>
         <w:tc>
@@ -9621,7 +9811,7 @@
           </w:tcPr>
           <w:p>
             <w:pPr>
-              <w:jc w:val="both"/>
+              <w:jc w:val="left"/>
               <w:rPr>
                 <w:sz w:val="24"/>
                 <w:szCs w:val="24"/>
@@ -9640,6 +9830,7 @@
       </w:tr>
       <w:tr>
         <w:trPr>
+          <w:cantSplit/>
           <w:jc w:val="center"/>
         </w:trPr>
         <w:tc>
@@ -9711,7 +9902,7 @@
           </w:tcPr>
           <w:p>
             <w:pPr>
-              <w:jc w:val="both"/>
+              <w:jc w:val="left"/>
               <w:rPr>
                 <w:sz w:val="24"/>
                 <w:szCs w:val="24"/>
@@ -9730,6 +9921,7 @@
       </w:tr>
       <w:tr>
         <w:trPr>
+          <w:cantSplit/>
           <w:jc w:val="center"/>
         </w:trPr>
         <w:tc>
@@ -9801,7 +9993,7 @@
           </w:tcPr>
           <w:p>
             <w:pPr>
-              <w:jc w:val="both"/>
+              <w:jc w:val="left"/>
               <w:rPr>
                 <w:sz w:val="24"/>
                 <w:szCs w:val="24"/>
@@ -9830,6 +10022,7 @@
     <w:p>
       <w:pPr>
         <w:pStyle w:val="Heading1"/>
+        <w:keepNext/>
         <w:numPr>
           <w:ilvl w:val="0"/>
           <w:numId w:val="7"/>
@@ -9862,6 +10055,10 @@
         <w:gridCol w:w="6765"/>
       </w:tblGrid>
       <w:tr>
+        <w:trPr>
+          <w:cantSplit/>
+          <w:tblHeader/>
+        </w:trPr>
         <w:tc>
           <w:tcPr>
             <w:tcW w:w="2745" w:type="dxa"/>
@@ -9874,6 +10071,7 @@
           </w:tcPr>
           <w:p>
             <w:pPr>
+              <w:keepNext/>
               <w:spacing w:after="120" w:line="252" w:lineRule="auto"/>
               <w:rPr>
                 <w:sz w:val="24"/>
@@ -9902,8 +10100,9 @@
           </w:tcPr>
           <w:p>
             <w:pPr>
+              <w:keepNext/>
               <w:spacing w:after="120" w:line="252" w:lineRule="auto"/>
-              <w:jc w:val="both"/>
+              <w:jc w:val="left"/>
               <w:rPr>
                 <w:sz w:val="24"/>
                 <w:szCs w:val="24"/>
@@ -9921,6 +10120,9 @@
         </w:tc>
       </w:tr>
       <w:tr>
+        <w:trPr>
+          <w:cantSplit/>
+        </w:trPr>
         <w:tc>
           <w:tcPr>
             <w:tcW w:w="2745" w:type="dxa"/>
@@ -9962,7 +10164,7 @@
           <w:p>
             <w:pPr>
               <w:spacing w:after="120" w:line="252" w:lineRule="auto"/>
-              <w:jc w:val="both"/>
+              <w:jc w:val="left"/>
               <w:rPr>
                 <w:sz w:val="24"/>
                 <w:szCs w:val="24"/>
@@ -9980,6 +10182,9 @@
         </w:tc>
       </w:tr>
       <w:tr>
+        <w:trPr>
+          <w:cantSplit/>
+        </w:trPr>
         <w:tc>
           <w:tcPr>
             <w:tcW w:w="2745" w:type="dxa"/>
@@ -10021,7 +10226,7 @@
           <w:p>
             <w:pPr>
               <w:spacing w:after="120" w:line="252" w:lineRule="auto"/>
-              <w:jc w:val="both"/>
+              <w:jc w:val="left"/>
               <w:rPr>
                 <w:sz w:val="24"/>
                 <w:szCs w:val="24"/>
@@ -10039,6 +10244,9 @@
         </w:tc>
       </w:tr>
       <w:tr>
+        <w:trPr>
+          <w:cantSplit/>
+        </w:trPr>
         <w:tc>
           <w:tcPr>
             <w:tcW w:w="2745" w:type="dxa"/>
@@ -10080,7 +10288,7 @@
           <w:p>
             <w:pPr>
               <w:spacing w:after="120" w:line="252" w:lineRule="auto"/>
-              <w:jc w:val="both"/>
+              <w:jc w:val="left"/>
               <w:rPr>
                 <w:sz w:val="24"/>
                 <w:szCs w:val="24"/>
@@ -10098,6 +10306,9 @@
         </w:tc>
       </w:tr>
       <w:tr>
+        <w:trPr>
+          <w:cantSplit/>
+        </w:trPr>
         <w:tc>
           <w:tcPr>
             <w:tcW w:w="2745" w:type="dxa"/>
@@ -10139,24 +10350,27 @@
           <w:p>
             <w:pPr>
               <w:spacing w:after="120" w:line="252" w:lineRule="auto"/>
-              <w:jc w:val="both"/>
-              <w:rPr>
-                <w:sz w:val="24"/>
-                <w:szCs w:val="24"/>
-              </w:rPr>
-            </w:pPr>
-            <w:r>
-              <w:rPr>
-                <w:b w:val="0"/>
-                <w:sz w:val="24"/>
-                <w:szCs w:val="24"/>
-              </w:rPr>
-              <w:t>HRGA Officer mencatat alfa (butir 6.3, USULAN pelaku). Pelaku pemotongan gaji belum ditetapkan di PP - Cuti BAB VI.</w:t>
+              <w:jc w:val="left"/>
+              <w:rPr>
+                <w:sz w:val="24"/>
+                <w:szCs w:val="24"/>
+              </w:rPr>
+            </w:pPr>
+            <w:r>
+              <w:rPr>
+                <w:b w:val="0"/>
+                <w:sz w:val="24"/>
+                <w:szCs w:val="24"/>
+              </w:rPr>
+              <w:t>HRGA Officer mencatat alfa sesuai butir 6.3 (USULAN: pelaku). Pelaku pemotongan gaji belum ditetapkan di PP - Cuti BAB VI.</w:t>
             </w:r>
           </w:p>
         </w:tc>
       </w:tr>
       <w:tr>
+        <w:trPr>
+          <w:cantSplit/>
+        </w:trPr>
         <w:tc>
           <w:tcPr>
             <w:tcW w:w="2745" w:type="dxa"/>
@@ -10198,24 +10412,27 @@
           <w:p>
             <w:pPr>
               <w:spacing w:after="120" w:line="252" w:lineRule="auto"/>
-              <w:jc w:val="both"/>
-              <w:rPr>
-                <w:sz w:val="24"/>
-                <w:szCs w:val="24"/>
-              </w:rPr>
-            </w:pPr>
-            <w:r>
-              <w:rPr>
-                <w:b w:val="0"/>
-                <w:sz w:val="24"/>
-                <w:szCs w:val="24"/>
-              </w:rPr>
-              <w:t>HRGA Officer mencatat alfa, dan HR Lead menentukan surat peringatan serta pemotongan cuti tahunan (butir 4.17, USULAN pelaku).</w:t>
+              <w:jc w:val="left"/>
+              <w:rPr>
+                <w:sz w:val="24"/>
+                <w:szCs w:val="24"/>
+              </w:rPr>
+            </w:pPr>
+            <w:r>
+              <w:rPr>
+                <w:b w:val="0"/>
+                <w:sz w:val="24"/>
+                <w:szCs w:val="24"/>
+              </w:rPr>
+              <w:t>HRGA Officer mencatat alfa, dan HR Lead menentukan surat peringatan serta pemotongan cuti tahunan sesuai butir 4.17 (USULAN: pelaku).</w:t>
             </w:r>
           </w:p>
         </w:tc>
       </w:tr>
       <w:tr>
+        <w:trPr>
+          <w:cantSplit/>
+        </w:trPr>
         <w:tc>
           <w:tcPr>
             <w:tcW w:w="2745" w:type="dxa"/>
@@ -10257,24 +10474,27 @@
           <w:p>
             <w:pPr>
               <w:spacing w:after="120" w:line="252" w:lineRule="auto"/>
-              <w:jc w:val="both"/>
-              <w:rPr>
-                <w:sz w:val="24"/>
-                <w:szCs w:val="24"/>
-              </w:rPr>
-            </w:pPr>
-            <w:r>
-              <w:rPr>
-                <w:b w:val="0"/>
-                <w:sz w:val="24"/>
-                <w:szCs w:val="24"/>
-              </w:rPr>
-              <w:t>HR Lead menentukan sanksi menurut butir 4.34 dan 4.35 (USULAN pelaku).</w:t>
+              <w:jc w:val="left"/>
+              <w:rPr>
+                <w:sz w:val="24"/>
+                <w:szCs w:val="24"/>
+              </w:rPr>
+            </w:pPr>
+            <w:r>
+              <w:rPr>
+                <w:b w:val="0"/>
+                <w:sz w:val="24"/>
+                <w:szCs w:val="24"/>
+              </w:rPr>
+              <w:t>HR Lead menentukan sanksi menurut butir 4.34 dan 4.35 (USULAN: pelaku).</w:t>
             </w:r>
           </w:p>
         </w:tc>
       </w:tr>
       <w:tr>
+        <w:trPr>
+          <w:cantSplit/>
+        </w:trPr>
         <w:tc>
           <w:tcPr>
             <w:tcW w:w="2745" w:type="dxa"/>
@@ -10316,24 +10536,27 @@
           <w:p>
             <w:pPr>
               <w:spacing w:after="120" w:line="252" w:lineRule="auto"/>
-              <w:jc w:val="both"/>
-              <w:rPr>
-                <w:sz w:val="24"/>
-                <w:szCs w:val="24"/>
-              </w:rPr>
-            </w:pPr>
-            <w:r>
-              <w:rPr>
-                <w:b w:val="0"/>
-                <w:sz w:val="24"/>
-                <w:szCs w:val="24"/>
-              </w:rPr>
-              <w:t>HR Lead menjalankan ketentuan peraturan perundang-undangan dan kebijakan Perusahaan tanpa mengurangi hak normatif pekerja (butir 4.12, USULAN pelaku).</w:t>
+              <w:jc w:val="left"/>
+              <w:rPr>
+                <w:sz w:val="24"/>
+                <w:szCs w:val="24"/>
+              </w:rPr>
+            </w:pPr>
+            <w:r>
+              <w:rPr>
+                <w:b w:val="0"/>
+                <w:sz w:val="24"/>
+                <w:szCs w:val="24"/>
+              </w:rPr>
+              <w:t>HR Lead menjalankan ketentuan peraturan perundang-undangan dan kebijakan Perusahaan tanpa mengurangi hak normatif pekerja sesuai butir 4.12 (USULAN: pelaku).</w:t>
             </w:r>
           </w:p>
         </w:tc>
       </w:tr>
       <w:tr>
+        <w:trPr>
+          <w:cantSplit/>
+        </w:trPr>
         <w:tc>
           <w:tcPr>
             <w:tcW w:w="2745" w:type="dxa"/>
@@ -10375,19 +10598,19 @@
           <w:p>
             <w:pPr>
               <w:spacing w:after="120" w:line="252" w:lineRule="auto"/>
-              <w:jc w:val="both"/>
-              <w:rPr>
-                <w:sz w:val="24"/>
-                <w:szCs w:val="24"/>
-              </w:rPr>
-            </w:pPr>
-            <w:r>
-              <w:rPr>
-                <w:b w:val="0"/>
-                <w:sz w:val="24"/>
-                <w:szCs w:val="24"/>
-              </w:rPr>
-              <w:t>HR Lead menetapkan cuti itu tanpa upah (butir 4.27, USULAN pelaku).</w:t>
+              <w:jc w:val="left"/>
+              <w:rPr>
+                <w:sz w:val="24"/>
+                <w:szCs w:val="24"/>
+              </w:rPr>
+            </w:pPr>
+            <w:r>
+              <w:rPr>
+                <w:b w:val="0"/>
+                <w:sz w:val="24"/>
+                <w:szCs w:val="24"/>
+              </w:rPr>
+              <w:t>HR Lead menetapkan cuti itu tanpa upah sesuai butir 4.27 (USULAN: pelaku).</w:t>
             </w:r>
           </w:p>
         </w:tc>
@@ -10446,7 +10669,7 @@
           <w:sz w:val="24"/>
           <w:szCs w:val="24"/>
         </w:rPr>
-        <w:t xml:space="preserve">HR Lead selaku pemilik SOP memeriksa kepatuhan terhadap SOP ini dengan membandingkan permohonan cuti di sistem HR dengan aturan di bagian 4 (USULAN).</w:t>
+        <w:t xml:space="preserve">HR Lead selaku pemilik SOP memeriksa kepatuhan terhadap SOP ini dengan mencocokkan permohonan cuti di sistem HR terhadap aturan di bagian 4 (USULAN).</w:t>
       </w:r>
     </w:p>
     <w:p>
@@ -10522,6 +10745,7 @@
     </w:p>
     <w:p>
       <w:pPr>
+        <w:keepNext/>
         <w:pBdr>
           <w:top w:val="nil"/>
           <w:left w:val="nil"/>
@@ -10568,6 +10792,8 @@
       </w:tblGrid>
       <w:tr>
         <w:trPr>
+          <w:cantSplit/>
+          <w:tblHeader/>
           <w:jc w:val="center"/>
         </w:trPr>
         <w:tc>
@@ -10577,6 +10803,7 @@
           </w:tcPr>
           <w:p>
             <w:pPr>
+              <w:keepNext/>
               <w:jc w:val="center"/>
               <w:rPr>
                 <w:sz w:val="24"/>
@@ -10601,6 +10828,7 @@
           </w:tcPr>
           <w:p>
             <w:pPr>
+              <w:keepNext/>
               <w:jc w:val="center"/>
               <w:rPr>
                 <w:sz w:val="24"/>
@@ -10621,6 +10849,7 @@
       </w:tr>
       <w:tr>
         <w:trPr>
+          <w:cantSplit/>
           <w:jc w:val="center"/>
         </w:trPr>
         <w:tc>
@@ -10670,6 +10899,7 @@
       </w:tr>
       <w:tr>
         <w:trPr>
+          <w:cantSplit/>
           <w:jc w:val="center"/>
         </w:trPr>
         <w:tc>
@@ -10719,6 +10949,7 @@
       </w:tr>
       <w:tr>
         <w:trPr>
+          <w:cantSplit/>
           <w:jc w:val="center"/>
         </w:trPr>
         <w:tc>
@@ -10761,13 +10992,14 @@
                 <w:sz w:val="24"/>
                 <w:szCs w:val="24"/>
               </w:rPr>
-              <w:t>Information Classification &amp; Handling; tingkat klasifikasi rekaman cuti.</w:t>
+              <w:t>Information Classification &amp; Handling; tingkat klasifikasi record cuti.</w:t>
             </w:r>
           </w:p>
         </w:tc>
       </w:tr>
       <w:tr>
         <w:trPr>
+          <w:cantSplit/>
           <w:jc w:val="center"/>
         </w:trPr>
         <w:tc>
@@ -10810,7 +11042,7 @@
                 <w:sz w:val="24"/>
                 <w:szCs w:val="24"/>
               </w:rPr>
-              <w:t>Dirujuk Pasal 33 ayat (2) sebagai pedoman besar upah sakit berkepanjangan; dikutip apa adanya dari sumber.</w:t>
+              <w:t>Dirujuk Pasal 33 ayat (2) sebagai pedoman besar upah sakit berkepanjangan; dikutip apa adanya dari PP - Cuti.</w:t>
             </w:r>
           </w:p>
         </w:tc>
@@ -10818,6 +11050,7 @@
     </w:tbl>
     <w:p>
       <w:pPr>
+        <w:keepNext/>
         <w:pBdr>
           <w:top w:val="nil"/>
           <w:left w:val="nil"/>
@@ -10857,6 +11090,8 @@
       </w:tblGrid>
       <w:tr>
         <w:trPr>
+          <w:cantSplit/>
+          <w:tblHeader/>
           <w:jc w:val="center"/>
         </w:trPr>
         <w:tc>
@@ -10872,6 +11107,7 @@
           </w:tcPr>
           <w:p>
             <w:pPr>
+              <w:keepNext/>
               <w:jc w:val="center"/>
               <w:rPr>
                 <w:sz w:val="24"/>
@@ -10902,6 +11138,7 @@
           </w:tcPr>
           <w:p>
             <w:pPr>
+              <w:keepNext/>
               <w:jc w:val="center"/>
               <w:rPr>
                 <w:sz w:val="24"/>
@@ -10932,6 +11169,7 @@
           </w:tcPr>
           <w:p>
             <w:pPr>
+              <w:keepNext/>
               <w:jc w:val="center"/>
               <w:rPr>
                 <w:sz w:val="24"/>
@@ -10952,6 +11190,7 @@
       </w:tr>
       <w:tr>
         <w:trPr>
+          <w:cantSplit/>
           <w:jc w:val="center"/>
         </w:trPr>
         <w:tc>
@@ -11023,7 +11262,7 @@
           </w:tcPr>
           <w:p>
             <w:pPr>
-              <w:jc w:val="both"/>
+              <w:jc w:val="left"/>
               <w:rPr>
                 <w:sz w:val="24"/>
                 <w:szCs w:val="24"/>
@@ -11042,6 +11281,7 @@
       </w:tr>
       <w:tr>
         <w:trPr>
+          <w:cantSplit/>
           <w:jc w:val="center"/>
         </w:trPr>
         <w:tc>
@@ -11113,7 +11353,7 @@
           </w:tcPr>
           <w:p>
             <w:pPr>
-              <w:jc w:val="both"/>
+              <w:jc w:val="left"/>
               <w:rPr>
                 <w:sz w:val="24"/>
                 <w:szCs w:val="24"/>
@@ -11132,6 +11372,7 @@
       </w:tr>
       <w:tr>
         <w:trPr>
+          <w:cantSplit/>
           <w:jc w:val="center"/>
         </w:trPr>
         <w:tc>
@@ -11203,7 +11444,7 @@
           </w:tcPr>
           <w:p>
             <w:pPr>
-              <w:jc w:val="both"/>
+              <w:jc w:val="left"/>
               <w:rPr>
                 <w:sz w:val="24"/>
                 <w:szCs w:val="24"/>

</xml_diff>

<commit_message>
ISO W10 audit cakupan label USULAN (batch COM, FAT, HR): 49 jalur, 18 diperbaiki ke cakupan bed1bb6
Satu koreksi worker: COM-REG-01 peran Business Development kembali memuat rujukan butir seperti bed1bb6, tanpa label menyeluruh. Build ulang 11 dokumen pass, halaman form tidak naik.

Co-Authored-By: Claude Opus 5.5 <noreply@anthropic.com>
Claude-Session: https://claude.ai/code/session_01BhkCQM7h3krZb9kjY2Nate
</commit_message>
<xml_diff>
--- a/out/02_HR/SNX-HR-SOP-08 Company Leaves (Rev00 DRAFT).docx
+++ b/out/02_HR/SNX-HR-SOP-08 Company Leaves (Rev00 DRAFT).docx
@@ -2586,7 +2586,7 @@
           <w:sz w:val="24"/>
           <w:szCs w:val="24"/>
         </w:rPr>
-        <w:t xml:space="preserve">Dikecualikan dari SOP ini: bekerja dari rumah (Pasal 31), karena Pasal 31 ayat (1) menyebutnya bukan cuti; hari libur resmi dan upah lembur (Pasal 22 ayat (1) sampai (3)); izin datang terlambat atau meninggalkan pekerjaan pada jam kerja (Pasal 29); dan pemutusan hubungan kerja. Hanya pengecualian pertama yang berasal dari PP - Cuti BAB VI; sisanya diturunkan dari kriteria aturan dan alur pengajuan berbagai jenis cuti (USULAN).</w:t>
+        <w:t xml:space="preserve">Dikecualikan dari SOP ini: bekerja dari rumah (Pasal 31), karena Pasal 31 ayat (1) menyebutnya bukan cuti; hari libur resmi dan upah lembur (Pasal 22 ayat (1) sampai (3)); izin datang terlambat atau meninggalkan pekerjaan pada jam kerja (Pasal 29); dan pemutusan hubungan kerja. Hanya pengecualian pertama yang berasal dari PP - Cuti BAB VI. Sisanya diturunkan dari kriteria aturan dan alur pengajuan berbagai jenis cuti (USULAN).</w:t>
       </w:r>
     </w:p>
     <w:p>
@@ -5074,7 +5074,7 @@
                 <w:sz w:val="24"/>
                 <w:szCs w:val="24"/>
               </w:rPr>
-              <w:t>Menerima pemberitahuan sakit, haid, penundaan cuti melahirkan, dan kelahiran bayi. Mencatat alfa, cuti haid, dan pembatalan cuti, mendaftarkan bayi sebagai tanggungan, serta memegang record cuti (USULAN).</w:t>
+              <w:t>Menerima pemberitahuan sakit, haid, penundaan cuti melahirkan, dan kelahiran bayi; mencatat alfa, cuti haid, dan pembatalan cuti, mendaftarkan bayi sebagai tanggungan, serta memegang record cuti (USULAN).</w:t>
             </w:r>
           </w:p>
         </w:tc>

</xml_diff>